<commit_message>
Correct GEM letterhead typography and document defaults after RC2 review
</commit_message>
<xml_diff>
--- a/GEM_Letterhead_Set_v1.0/00_source/GEM_Letterhead_Portfolio.docx
+++ b/GEM_Letterhead_Set_v1.0/00_source/GEM_Letterhead_Portfolio.docx
@@ -4,7 +4,7 @@
   <w:body>
     <w:p>
       <w:pPr>
-        <w:spacing w:after="180" w:before="0" w:line="210" w:lineRule="exact"/>
+        <w:spacing w:after="180" w:before="0" w:line="240" w:lineRule="exact"/>
         <w:jc w:val="left"/>
         <w:keepNext w:val="0"/>
         <w:widowControl/>
@@ -19,13 +19,14 @@
           <w:lang w:val="en-GB" w:bidi="en-GB"/>
           <w:rtl w:val="0"/>
           <w:szCs w:val="15"/>
+          <w:bCs w:val="0"/>
         </w:rPr>
         <w:t>SAMPLE CONTENT</w:t>
       </w:r>
     </w:p>
     <w:p>
       <w:pPr>
-        <w:spacing w:after="200" w:before="0" w:line="238" w:lineRule="exact"/>
+        <w:spacing w:after="200" w:before="0" w:line="272" w:lineRule="exact"/>
         <w:jc w:val="left"/>
         <w:keepNext w:val="0"/>
         <w:widowControl/>
@@ -40,13 +41,14 @@
           <w:lang w:val="en-GB" w:bidi="en-GB"/>
           <w:rtl w:val="0"/>
           <w:szCs w:val="17"/>
+          <w:bCs w:val="0"/>
         </w:rPr>
         <w:t>Date: [DATE]    Reference: [REFERENCE NUMBER]</w:t>
       </w:r>
     </w:p>
     <w:p>
       <w:pPr>
-        <w:spacing w:after="200" w:before="0" w:line="294" w:lineRule="exact"/>
+        <w:spacing w:after="200" w:before="0" w:line="336" w:lineRule="exact"/>
         <w:jc w:val="left"/>
         <w:keepNext/>
         <w:widowControl/>
@@ -61,6 +63,7 @@
           <w:lang w:val="en-GB" w:bidi="en-GB"/>
           <w:rtl w:val="0"/>
           <w:szCs w:val="21"/>
+          <w:bCs w:val="0"/>
         </w:rPr>
         <w:t>[RECIPIENT NAME]</w:t>
         <w:br/>
@@ -74,7 +77,7 @@
     <w:p>
       <w:pPr>
         <w:pStyle w:val="Heading1"/>
-        <w:spacing w:after="240" w:before="0" w:line="336" w:lineRule="exact"/>
+        <w:spacing w:after="240" w:before="0" w:line="384" w:lineRule="exact"/>
         <w:jc w:val="left"/>
         <w:keepNext/>
         <w:widowControl/>
@@ -83,19 +86,20 @@
       <w:r>
         <w:rPr>
           <w:rFonts w:ascii="Jost" w:hAnsi="Jost" w:cs="Jost" w:eastAsia="Jost"/>
-          <w:b/>
+          <w:b w:val="0"/>
           <w:color w:val="12171D"/>
           <w:sz w:val="24"/>
           <w:lang w:val="en-GB" w:bidi="en-GB"/>
           <w:rtl w:val="0"/>
           <w:szCs w:val="24"/>
+          <w:bCs w:val="0"/>
         </w:rPr>
         <w:t>Request for supplier information and product documentation</w:t>
       </w:r>
     </w:p>
     <w:p>
       <w:pPr>
-        <w:spacing w:after="200" w:before="0" w:line="294" w:lineRule="exact"/>
+        <w:spacing w:after="200" w:before="0" w:line="336" w:lineRule="exact"/>
         <w:jc w:val="left"/>
         <w:keepNext w:val="0"/>
         <w:widowControl/>
@@ -110,13 +114,16 @@
           <w:lang w:val="en-GB" w:bidi="en-GB"/>
           <w:rtl w:val="0"/>
           <w:szCs w:val="21"/>
+          <w:bCs w:val="0"/>
         </w:rPr>
         <w:t>Dear [RECIPIENT NAME],</w:t>
       </w:r>
     </w:p>
     <w:p>
       <w:pPr>
-        <w:spacing w:after="120" w:before="0" w:line="294" w:lineRule="exact"/>
+        <w:pStyle w:val="BodyText"/>
+        <w:spacing w:after="120" w:before="0" w:line="336" w:lineRule="exact"/>
+        <w:ind w:right="1701"/>
         <w:jc w:val="left"/>
         <w:keepNext w:val="0"/>
         <w:widowControl/>
@@ -131,13 +138,16 @@
           <w:lang w:val="en-GB" w:bidi="en-GB"/>
           <w:rtl w:val="0"/>
           <w:szCs w:val="21"/>
+          <w:bCs w:val="0"/>
         </w:rPr>
         <w:t>Please share the available product information and supporting documentation for our internal review. Indicate which details are confirmed and which require further validation.</w:t>
       </w:r>
     </w:p>
     <w:p>
       <w:pPr>
-        <w:spacing w:after="120" w:before="0" w:line="294" w:lineRule="exact"/>
+        <w:pStyle w:val="BodyText"/>
+        <w:spacing w:after="120" w:before="0" w:line="336" w:lineRule="exact"/>
+        <w:ind w:right="1701"/>
         <w:jc w:val="left"/>
         <w:keepNext w:val="0"/>
         <w:widowControl/>
@@ -152,13 +162,14 @@
           <w:lang w:val="en-GB" w:bidi="en-GB"/>
           <w:rtl w:val="0"/>
           <w:szCs w:val="21"/>
+          <w:bCs w:val="0"/>
         </w:rPr>
         <w:t>We would welcome a concise response identifying the relevant contact and any information needed from us. This sample does not create a commercial commitment or confirm a supplier relationship.</w:t>
       </w:r>
     </w:p>
     <w:p>
       <w:pPr>
-        <w:spacing w:after="80" w:before="200" w:line="294" w:lineRule="exact"/>
+        <w:spacing w:after="80" w:before="200" w:line="336" w:lineRule="exact"/>
         <w:jc w:val="left"/>
         <w:keepNext/>
         <w:widowControl/>
@@ -173,13 +184,14 @@
           <w:lang w:val="en-GB" w:bidi="en-GB"/>
           <w:rtl w:val="0"/>
           <w:szCs w:val="21"/>
+          <w:bCs w:val="0"/>
         </w:rPr>
         <w:t>Yours sincerely,</w:t>
       </w:r>
     </w:p>
     <w:p>
       <w:pPr>
-        <w:spacing w:after="80" w:before="907" w:line="224" w:lineRule="exact"/>
+        <w:spacing w:after="80" w:before="907" w:line="256" w:lineRule="exact"/>
         <w:jc w:val="left"/>
         <w:keepNext/>
         <w:widowControl/>
@@ -194,13 +206,14 @@
           <w:lang w:val="en-GB" w:bidi="en-GB"/>
           <w:rtl w:val="0"/>
           <w:szCs w:val="16"/>
+          <w:bCs w:val="0"/>
         </w:rPr>
         <w:t>[SIGNATURE]</w:t>
       </w:r>
     </w:p>
     <w:p>
       <w:pPr>
-        <w:spacing w:after="0" w:before="0" w:line="294" w:lineRule="exact"/>
+        <w:spacing w:after="0" w:before="0" w:line="336" w:lineRule="exact"/>
         <w:jc w:val="left"/>
         <w:keepNext w:val="0"/>
         <w:widowControl/>
@@ -209,12 +222,13 @@
       <w:r>
         <w:rPr>
           <w:rFonts w:ascii="Inter" w:hAnsi="Inter" w:cs="Inter" w:eastAsia="Inter"/>
-          <w:b/>
+          <w:b w:val="0"/>
           <w:color w:val="12171D"/>
           <w:sz w:val="21"/>
           <w:lang w:val="en-GB" w:bidi="en-GB"/>
           <w:rtl w:val="0"/>
           <w:szCs w:val="21"/>
+          <w:bCs w:val="0"/>
         </w:rPr>
         <w:t>[SIGNATORY NAME]</w:t>
         <w:br/>
@@ -238,7 +252,7 @@
     </w:p>
     <w:p>
       <w:pPr>
-        <w:spacing w:after="180" w:before="0" w:line="210" w:lineRule="exact"/>
+        <w:spacing w:after="180" w:before="0" w:line="240" w:lineRule="exact"/>
         <w:jc w:val="left"/>
         <w:keepNext w:val="0"/>
         <w:widowControl/>
@@ -253,13 +267,14 @@
           <w:lang w:val="en-GB" w:bidi="en-GB"/>
           <w:rtl w:val="0"/>
           <w:szCs w:val="15"/>
+          <w:bCs w:val="0"/>
         </w:rPr>
         <w:t>SAMPLE CONTENT</w:t>
       </w:r>
     </w:p>
     <w:p>
       <w:pPr>
-        <w:spacing w:after="240" w:before="0" w:line="294" w:lineRule="exact"/>
+        <w:spacing w:after="240" w:before="0" w:line="336" w:lineRule="exact"/>
         <w:jc w:val="left"/>
         <w:keepNext w:val="0"/>
         <w:widowControl/>
@@ -274,13 +289,16 @@
           <w:lang w:val="en-GB" w:bidi="en-GB"/>
           <w:rtl w:val="0"/>
           <w:szCs w:val="21"/>
+          <w:bCs w:val="0"/>
         </w:rPr>
         <w:t>[Continuation text]</w:t>
       </w:r>
     </w:p>
     <w:p>
       <w:pPr>
-        <w:spacing w:after="120" w:before="0" w:line="294" w:lineRule="exact"/>
+        <w:pStyle w:val="BodyText"/>
+        <w:spacing w:after="120" w:before="0" w:line="336" w:lineRule="exact"/>
+        <w:ind w:right="1701"/>
         <w:jc w:val="left"/>
         <w:keepNext w:val="0"/>
         <w:widowControl/>
@@ -295,13 +313,16 @@
           <w:lang w:val="en-GB" w:bidi="en-GB"/>
           <w:rtl w:val="0"/>
           <w:szCs w:val="21"/>
+          <w:bCs w:val="0"/>
         </w:rPr>
         <w:t>Please share the available product information and supporting documentation for our internal review. Indicate which details are confirmed and which require further validation.</w:t>
       </w:r>
     </w:p>
     <w:p>
       <w:pPr>
-        <w:spacing w:after="120" w:before="0" w:line="294" w:lineRule="exact"/>
+        <w:pStyle w:val="BodyText"/>
+        <w:spacing w:after="120" w:before="0" w:line="336" w:lineRule="exact"/>
+        <w:ind w:right="1701"/>
         <w:jc w:val="left"/>
         <w:keepNext w:val="0"/>
         <w:widowControl/>
@@ -316,13 +337,14 @@
           <w:lang w:val="en-GB" w:bidi="en-GB"/>
           <w:rtl w:val="0"/>
           <w:szCs w:val="21"/>
+          <w:bCs w:val="0"/>
         </w:rPr>
         <w:t>We would welcome a concise response identifying the relevant contact and any information needed from us. This sample does not create a commercial commitment or confirm a supplier relationship.</w:t>
       </w:r>
     </w:p>
     <w:p>
       <w:pPr>
-        <w:spacing w:after="80" w:before="200" w:line="294" w:lineRule="exact"/>
+        <w:spacing w:after="80" w:before="200" w:line="336" w:lineRule="exact"/>
         <w:jc w:val="left"/>
         <w:keepNext/>
         <w:widowControl/>
@@ -337,13 +359,14 @@
           <w:lang w:val="en-GB" w:bidi="en-GB"/>
           <w:rtl w:val="0"/>
           <w:szCs w:val="21"/>
+          <w:bCs w:val="0"/>
         </w:rPr>
         <w:t>Yours sincerely,</w:t>
       </w:r>
     </w:p>
     <w:p>
       <w:pPr>
-        <w:spacing w:after="80" w:before="907" w:line="224" w:lineRule="exact"/>
+        <w:spacing w:after="80" w:before="907" w:line="256" w:lineRule="exact"/>
         <w:jc w:val="left"/>
         <w:keepNext/>
         <w:widowControl/>
@@ -358,13 +381,14 @@
           <w:lang w:val="en-GB" w:bidi="en-GB"/>
           <w:rtl w:val="0"/>
           <w:szCs w:val="16"/>
+          <w:bCs w:val="0"/>
         </w:rPr>
         <w:t>[SIGNATURE]</w:t>
       </w:r>
     </w:p>
     <w:p>
       <w:pPr>
-        <w:spacing w:after="0" w:before="0" w:line="294" w:lineRule="exact"/>
+        <w:spacing w:after="0" w:before="0" w:line="336" w:lineRule="exact"/>
         <w:jc w:val="left"/>
         <w:keepNext w:val="0"/>
         <w:widowControl/>
@@ -373,12 +397,13 @@
       <w:r>
         <w:rPr>
           <w:rFonts w:ascii="Inter" w:hAnsi="Inter" w:cs="Inter" w:eastAsia="Inter"/>
-          <w:b/>
+          <w:b w:val="0"/>
           <w:color w:val="12171D"/>
           <w:sz w:val="21"/>
           <w:lang w:val="en-GB" w:bidi="en-GB"/>
           <w:rtl w:val="0"/>
           <w:szCs w:val="21"/>
+          <w:bCs w:val="0"/>
         </w:rPr>
         <w:t>[SIGNATORY NAME]</w:t>
         <w:br/>
@@ -401,7 +426,7 @@
     </w:p>
     <w:p>
       <w:pPr>
-        <w:spacing w:after="180" w:before="0" w:line="210" w:lineRule="exact"/>
+        <w:spacing w:after="180" w:before="0" w:line="240" w:lineRule="exact"/>
         <w:jc w:val="right"/>
         <w:keepNext w:val="0"/>
         <w:widowControl/>
@@ -416,6 +441,7 @@
           <w:lang w:val="en-GB" w:bidi="en-GB"/>
           <w:rtl w:val="0"/>
           <w:szCs w:val="15"/>
+          <w:bCs w:val="0"/>
         </w:rPr>
         <w:t>SAMPLE CONTENT · PENDING LOCALIZATION APPROVAL</w:t>
       </w:r>
@@ -437,6 +463,7 @@
           <w:lang w:val="ar-SA" w:bidi="ar-SA"/>
           <w:rtl w:val="1"/>
           <w:szCs w:val="20"/>
+          <w:bCs w:val="0"/>
         </w:rPr>
         <w:t xml:space="preserve">التاريخ: </w:t>
       </w:r>
@@ -449,6 +476,7 @@
           <w:lang w:val="en-GB" w:bidi="en-GB"/>
           <w:rtl w:val="0"/>
           <w:szCs w:val="18"/>
+          <w:bCs w:val="0"/>
         </w:rPr>
         <w:t>[DATE]</w:t>
       </w:r>
@@ -461,6 +489,7 @@
           <w:lang w:val="ar-SA" w:bidi="ar-SA"/>
           <w:rtl w:val="1"/>
           <w:szCs w:val="20"/>
+          <w:bCs w:val="0"/>
         </w:rPr>
         <w:t xml:space="preserve">    المرجع: </w:t>
       </w:r>
@@ -473,6 +502,7 @@
           <w:lang w:val="en-GB" w:bidi="en-GB"/>
           <w:rtl w:val="0"/>
           <w:szCs w:val="18"/>
+          <w:bCs w:val="0"/>
         </w:rPr>
         <w:t>[REFERENCE NUMBER]</w:t>
       </w:r>
@@ -494,6 +524,7 @@
           <w:lang w:val="ar-SA" w:bidi="ar-SA"/>
           <w:rtl w:val="1"/>
           <w:szCs w:val="23"/>
+          <w:bCs w:val="0"/>
         </w:rPr>
         <w:t>«اسم المستلم»</w:t>
         <w:br/>
@@ -514,13 +545,13 @@
       <w:r>
         <w:rPr>
           <w:rFonts w:ascii="Noto Sans Arabic" w:hAnsi="Noto Sans Arabic" w:cs="Noto Sans Arabic" w:eastAsia="Noto Sans Arabic"/>
-          <w:b/>
+          <w:b w:val="0"/>
           <w:color w:val="12171D"/>
           <w:sz w:val="24"/>
           <w:lang w:val="ar-SA" w:bidi="ar-SA"/>
           <w:rtl w:val="1"/>
           <w:szCs w:val="24"/>
-          <w:bCs/>
+          <w:bCs w:val="0"/>
         </w:rPr>
         <w:t>الموضوع: طلب معلومات ووثائق من المورد</w:t>
       </w:r>
@@ -542,6 +573,7 @@
           <w:lang w:val="ar-SA" w:bidi="ar-SA"/>
           <w:rtl w:val="1"/>
           <w:szCs w:val="23"/>
+          <w:bCs w:val="0"/>
         </w:rPr>
         <w:t>السادة «اسم الجهة»،</w:t>
       </w:r>
@@ -563,6 +595,7 @@
           <w:lang w:val="ar-SA" w:bidi="ar-SA"/>
           <w:rtl w:val="1"/>
           <w:szCs w:val="23"/>
+          <w:bCs w:val="0"/>
         </w:rPr>
         <w:t>يرجى تزويدنا بالمعلومات والوثائق المتاحة للمراجعة الداخلية، مع توضيح ما تم تأكيده وما يحتاج إلى تحقق إضافي.</w:t>
       </w:r>
@@ -584,6 +617,7 @@
           <w:lang w:val="ar-SA" w:bidi="ar-SA"/>
           <w:rtl w:val="1"/>
           <w:szCs w:val="23"/>
+          <w:bCs w:val="0"/>
         </w:rPr>
         <w:t>هذا النص نموذج للمراسلات فقط، ولا يثبت علاقة تجارية أو التزاماً تعاقدياً.</w:t>
       </w:r>
@@ -605,6 +639,7 @@
           <w:lang w:val="ar-SA" w:bidi="ar-SA"/>
           <w:rtl w:val="1"/>
           <w:szCs w:val="23"/>
+          <w:bCs w:val="0"/>
         </w:rPr>
         <w:t>وتفضلوا بقبول التحية،</w:t>
       </w:r>
@@ -626,6 +661,7 @@
           <w:lang w:val="ar-SA" w:bidi="ar-SA"/>
           <w:rtl w:val="1"/>
           <w:szCs w:val="18"/>
+          <w:bCs w:val="0"/>
         </w:rPr>
         <w:t>«التوقيع»</w:t>
       </w:r>
@@ -641,13 +677,13 @@
       <w:r>
         <w:rPr>
           <w:rFonts w:ascii="Noto Sans Arabic" w:hAnsi="Noto Sans Arabic" w:cs="Noto Sans Arabic" w:eastAsia="Noto Sans Arabic"/>
-          <w:b/>
+          <w:b w:val="0"/>
           <w:color w:val="12171D"/>
           <w:sz w:val="23"/>
           <w:lang w:val="ar-SA" w:bidi="ar-SA"/>
           <w:rtl w:val="1"/>
           <w:szCs w:val="23"/>
-          <w:bCs/>
+          <w:bCs w:val="0"/>
         </w:rPr>
         <w:t>«اسم الموقّع»</w:t>
         <w:br/>
@@ -671,7 +707,7 @@
     </w:p>
     <w:p>
       <w:pPr>
-        <w:spacing w:after="180" w:before="0" w:line="210" w:lineRule="exact"/>
+        <w:spacing w:after="180" w:before="0" w:line="240" w:lineRule="exact"/>
         <w:jc w:val="right"/>
         <w:keepNext w:val="0"/>
         <w:widowControl/>
@@ -686,6 +722,7 @@
           <w:lang w:val="en-GB" w:bidi="en-GB"/>
           <w:rtl w:val="0"/>
           <w:szCs w:val="15"/>
+          <w:bCs w:val="0"/>
         </w:rPr>
         <w:t>SAMPLE CONTENT · PENDING LOCALIZATION APPROVAL</w:t>
       </w:r>
@@ -707,6 +744,7 @@
           <w:lang w:val="ar-SA" w:bidi="ar-SA"/>
           <w:rtl w:val="1"/>
           <w:szCs w:val="23"/>
+          <w:bCs w:val="0"/>
         </w:rPr>
         <w:t>[نص الصفحة التالية]</w:t>
       </w:r>
@@ -728,6 +766,7 @@
           <w:lang w:val="ar-SA" w:bidi="ar-SA"/>
           <w:rtl w:val="1"/>
           <w:szCs w:val="23"/>
+          <w:bCs w:val="0"/>
         </w:rPr>
         <w:t>يرجى تزويدنا بالمعلومات والوثائق المتاحة للمراجعة الداخلية، مع توضيح ما تم تأكيده وما يحتاج إلى تحقق إضافي.</w:t>
       </w:r>
@@ -749,6 +788,7 @@
           <w:lang w:val="ar-SA" w:bidi="ar-SA"/>
           <w:rtl w:val="1"/>
           <w:szCs w:val="23"/>
+          <w:bCs w:val="0"/>
         </w:rPr>
         <w:t>هذا النص نموذج للمراسلات فقط، ولا يثبت علاقة تجارية أو التزاماً تعاقدياً.</w:t>
       </w:r>
@@ -770,6 +810,7 @@
           <w:lang w:val="ar-SA" w:bidi="ar-SA"/>
           <w:rtl w:val="1"/>
           <w:szCs w:val="23"/>
+          <w:bCs w:val="0"/>
         </w:rPr>
         <w:t>وتفضلوا بقبول التحية،</w:t>
       </w:r>
@@ -791,6 +832,7 @@
           <w:lang w:val="ar-SA" w:bidi="ar-SA"/>
           <w:rtl w:val="1"/>
           <w:szCs w:val="18"/>
+          <w:bCs w:val="0"/>
         </w:rPr>
         <w:t>«التوقيع»</w:t>
       </w:r>
@@ -806,13 +848,13 @@
       <w:r>
         <w:rPr>
           <w:rFonts w:ascii="Noto Sans Arabic" w:hAnsi="Noto Sans Arabic" w:cs="Noto Sans Arabic" w:eastAsia="Noto Sans Arabic"/>
-          <w:b/>
+          <w:b w:val="0"/>
           <w:color w:val="12171D"/>
           <w:sz w:val="23"/>
           <w:lang w:val="ar-SA" w:bidi="ar-SA"/>
           <w:rtl w:val="1"/>
           <w:szCs w:val="23"/>
-          <w:bCs/>
+          <w:bCs w:val="0"/>
         </w:rPr>
         <w:t>«اسم الموقّع»</w:t>
         <w:br/>
@@ -835,7 +877,7 @@
     </w:p>
     <w:p>
       <w:pPr>
-        <w:spacing w:after="180" w:before="0" w:line="210" w:lineRule="exact"/>
+        <w:spacing w:after="180" w:before="0" w:line="240" w:lineRule="exact"/>
         <w:jc w:val="right"/>
         <w:keepNext w:val="0"/>
         <w:widowControl/>
@@ -850,6 +892,7 @@
           <w:lang w:val="en-GB" w:bidi="en-GB"/>
           <w:rtl w:val="0"/>
           <w:szCs w:val="15"/>
+          <w:bCs w:val="0"/>
         </w:rPr>
         <w:t>SAMPLE CONTENT · PENDING LOCALIZATION APPROVAL</w:t>
       </w:r>
@@ -871,6 +914,7 @@
           <w:lang w:val="ar-SA" w:bidi="ar-SA"/>
           <w:rtl w:val="1"/>
           <w:szCs w:val="20"/>
+          <w:bCs w:val="0"/>
         </w:rPr>
         <w:t xml:space="preserve">التاريخ: </w:t>
       </w:r>
@@ -883,6 +927,7 @@
           <w:lang w:val="en-GB" w:bidi="en-GB"/>
           <w:rtl w:val="0"/>
           <w:szCs w:val="18"/>
+          <w:bCs w:val="0"/>
         </w:rPr>
         <w:t>[DATE]</w:t>
       </w:r>
@@ -895,6 +940,7 @@
           <w:lang w:val="ar-SA" w:bidi="ar-SA"/>
           <w:rtl w:val="1"/>
           <w:szCs w:val="20"/>
+          <w:bCs w:val="0"/>
         </w:rPr>
         <w:t xml:space="preserve">    المرجع: </w:t>
       </w:r>
@@ -907,6 +953,7 @@
           <w:lang w:val="en-GB" w:bidi="en-GB"/>
           <w:rtl w:val="0"/>
           <w:szCs w:val="18"/>
+          <w:bCs w:val="0"/>
         </w:rPr>
         <w:t>[REFERENCE NUMBER]</w:t>
       </w:r>
@@ -928,6 +975,7 @@
           <w:lang w:val="ar-SA" w:bidi="ar-SA"/>
           <w:rtl w:val="1"/>
           <w:szCs w:val="23"/>
+          <w:bCs w:val="0"/>
         </w:rPr>
         <w:t>«اسم المستلم»</w:t>
         <w:br/>
@@ -938,7 +986,7 @@
     </w:p>
     <w:p>
       <w:pPr>
-        <w:spacing w:after="140" w:before="0" w:line="252" w:lineRule="exact"/>
+        <w:spacing w:after="140" w:before="0" w:line="288" w:lineRule="exact"/>
         <w:jc w:val="left"/>
         <w:keepNext/>
         <w:widowControl/>
@@ -953,6 +1001,7 @@
           <w:lang w:val="en-GB" w:bidi="en-GB"/>
           <w:rtl w:val="0"/>
           <w:szCs w:val="18"/>
+          <w:bCs w:val="0"/>
         </w:rPr>
         <w:t>[RECIPIENT NAME] · [ORGANIZATION]</w:t>
         <w:br/>
@@ -971,13 +1020,13 @@
       <w:r>
         <w:rPr>
           <w:rFonts w:ascii="Noto Sans Arabic" w:hAnsi="Noto Sans Arabic" w:cs="Noto Sans Arabic" w:eastAsia="Noto Sans Arabic"/>
-          <w:b/>
+          <w:b w:val="0"/>
           <w:color w:val="12171D"/>
           <w:sz w:val="24"/>
           <w:lang w:val="ar-SA" w:bidi="ar-SA"/>
           <w:rtl w:val="1"/>
           <w:szCs w:val="24"/>
-          <w:bCs/>
+          <w:bCs w:val="0"/>
         </w:rPr>
         <w:t>الموضوع: طلب معلومات ووثائق من المورد</w:t>
       </w:r>
@@ -985,7 +1034,7 @@
     <w:p>
       <w:pPr>
         <w:pStyle w:val="Heading1"/>
-        <w:spacing w:after="240" w:before="0" w:line="336" w:lineRule="exact"/>
+        <w:spacing w:after="240" w:before="0" w:line="384" w:lineRule="exact"/>
         <w:jc w:val="left"/>
         <w:keepNext/>
         <w:widowControl/>
@@ -994,12 +1043,13 @@
       <w:r>
         <w:rPr>
           <w:rFonts w:ascii="Jost" w:hAnsi="Jost" w:cs="Jost" w:eastAsia="Jost"/>
-          <w:b/>
+          <w:b w:val="0"/>
           <w:color w:val="12171D"/>
           <w:sz w:val="24"/>
           <w:lang w:val="en-GB" w:bidi="en-GB"/>
           <w:rtl w:val="0"/>
           <w:szCs w:val="24"/>
+          <w:bCs w:val="0"/>
         </w:rPr>
         <w:t>Request for supplier information and product documentation</w:t>
       </w:r>
@@ -1021,6 +1071,7 @@
           <w:lang w:val="ar-SA" w:bidi="ar-SA"/>
           <w:rtl w:val="1"/>
           <w:szCs w:val="23"/>
+          <w:bCs w:val="0"/>
         </w:rPr>
         <w:t>السادة «اسم الجهة»،</w:t>
       </w:r>
@@ -1042,13 +1093,14 @@
           <w:lang w:val="ar-SA" w:bidi="ar-SA"/>
           <w:rtl w:val="1"/>
           <w:szCs w:val="23"/>
+          <w:bCs w:val="0"/>
         </w:rPr>
         <w:t>يرجى تزويدنا بالمعلومات والوثائق المتاحة للمراجعة الداخلية، مع توضيح ما تم تأكيده وما يحتاج إلى تحقق إضافي.</w:t>
       </w:r>
     </w:p>
     <w:p>
       <w:pPr>
-        <w:spacing w:after="120" w:before="0" w:line="294" w:lineRule="exact"/>
+        <w:spacing w:after="120" w:before="0" w:line="336" w:lineRule="exact"/>
         <w:jc w:val="left"/>
         <w:keepNext w:val="0"/>
         <w:widowControl/>
@@ -1063,13 +1115,16 @@
           <w:lang w:val="en-GB" w:bidi="en-GB"/>
           <w:rtl w:val="0"/>
           <w:szCs w:val="21"/>
+          <w:bCs w:val="0"/>
         </w:rPr>
         <w:t>Dear [RECIPIENT NAME],</w:t>
       </w:r>
     </w:p>
     <w:p>
       <w:pPr>
-        <w:spacing w:after="120" w:before="0" w:line="294" w:lineRule="exact"/>
+        <w:pStyle w:val="BodyText"/>
+        <w:spacing w:after="120" w:before="0" w:line="336" w:lineRule="exact"/>
+        <w:ind w:right="1701"/>
         <w:jc w:val="left"/>
         <w:keepNext w:val="0"/>
         <w:widowControl/>
@@ -1084,6 +1139,7 @@
           <w:lang w:val="en-GB" w:bidi="en-GB"/>
           <w:rtl w:val="0"/>
           <w:szCs w:val="21"/>
+          <w:bCs w:val="0"/>
         </w:rPr>
         <w:t>Please share the available information and documentation for our internal review, identifying confirmed details and items requiring further validation.</w:t>
       </w:r>
@@ -1105,13 +1161,14 @@
           <w:lang w:val="ar-SA" w:bidi="ar-SA"/>
           <w:rtl w:val="1"/>
           <w:szCs w:val="23"/>
+          <w:bCs w:val="0"/>
         </w:rPr>
         <w:t>وتفضلوا بقبول التحية،</w:t>
       </w:r>
     </w:p>
     <w:p>
       <w:pPr>
-        <w:spacing w:after="40" w:before="0" w:line="294" w:lineRule="exact"/>
+        <w:spacing w:after="40" w:before="0" w:line="336" w:lineRule="exact"/>
         <w:jc w:val="left"/>
         <w:keepNext/>
         <w:widowControl/>
@@ -1126,6 +1183,7 @@
           <w:lang w:val="en-GB" w:bidi="en-GB"/>
           <w:rtl w:val="0"/>
           <w:szCs w:val="21"/>
+          <w:bCs w:val="0"/>
         </w:rPr>
         <w:t>Yours sincerely,</w:t>
       </w:r>
@@ -1147,6 +1205,7 @@
           <w:lang w:val="ar-SA" w:bidi="ar-SA"/>
           <w:rtl w:val="1"/>
           <w:szCs w:val="18"/>
+          <w:bCs w:val="0"/>
         </w:rPr>
         <w:t>«التوقيع»</w:t>
       </w:r>
@@ -1162,13 +1221,13 @@
       <w:r>
         <w:rPr>
           <w:rFonts w:ascii="Noto Sans Arabic" w:hAnsi="Noto Sans Arabic" w:cs="Noto Sans Arabic" w:eastAsia="Noto Sans Arabic"/>
-          <w:b/>
+          <w:b w:val="0"/>
           <w:color w:val="12171D"/>
           <w:sz w:val="23"/>
           <w:lang w:val="ar-SA" w:bidi="ar-SA"/>
           <w:rtl w:val="1"/>
           <w:szCs w:val="23"/>
-          <w:bCs/>
+          <w:bCs w:val="0"/>
         </w:rPr>
         <w:t>«اسم الموقّع»</w:t>
         <w:br/>
@@ -1177,7 +1236,7 @@
     </w:p>
     <w:p>
       <w:pPr>
-        <w:spacing w:after="0" w:before="0" w:line="252" w:lineRule="exact"/>
+        <w:spacing w:after="0" w:before="0" w:line="288" w:lineRule="exact"/>
         <w:jc w:val="left"/>
         <w:keepNext w:val="0"/>
         <w:widowControl/>
@@ -1192,6 +1251,7 @@
           <w:lang w:val="en-GB" w:bidi="en-GB"/>
           <w:rtl w:val="0"/>
           <w:szCs w:val="18"/>
+          <w:bCs w:val="0"/>
         </w:rPr>
         <w:t>[SIGNATORY NAME] · [TITLE]</w:t>
       </w:r>
@@ -1213,7 +1273,7 @@
     </w:p>
     <w:p>
       <w:pPr>
-        <w:spacing w:after="180" w:before="0" w:line="210" w:lineRule="exact"/>
+        <w:spacing w:after="180" w:before="0" w:line="240" w:lineRule="exact"/>
         <w:jc w:val="right"/>
         <w:keepNext w:val="0"/>
         <w:widowControl/>
@@ -1228,6 +1288,7 @@
           <w:lang w:val="en-GB" w:bidi="en-GB"/>
           <w:rtl w:val="0"/>
           <w:szCs w:val="15"/>
+          <w:bCs w:val="0"/>
         </w:rPr>
         <w:t>SAMPLE CONTENT · PENDING LOCALIZATION APPROVAL</w:t>
       </w:r>
@@ -1249,6 +1310,7 @@
           <w:lang w:val="ar-SA" w:bidi="ar-SA"/>
           <w:rtl w:val="1"/>
           <w:szCs w:val="23"/>
+          <w:bCs w:val="0"/>
         </w:rPr>
         <w:t>[نص الصفحة التالية]</w:t>
       </w:r>
@@ -1270,13 +1332,16 @@
           <w:lang w:val="ar-SA" w:bidi="ar-SA"/>
           <w:rtl w:val="1"/>
           <w:szCs w:val="23"/>
+          <w:bCs w:val="0"/>
         </w:rPr>
         <w:t>يرجى تزويدنا بالمعلومات والوثائق المتاحة للمراجعة الداخلية، مع توضيح ما تم تأكيده وما يحتاج إلى تحقق إضافي.</w:t>
       </w:r>
     </w:p>
     <w:p>
       <w:pPr>
-        <w:spacing w:after="120" w:before="0" w:line="294" w:lineRule="exact"/>
+        <w:pStyle w:val="BodyText"/>
+        <w:spacing w:after="120" w:before="0" w:line="336" w:lineRule="exact"/>
+        <w:ind w:right="1701"/>
         <w:jc w:val="left"/>
         <w:keepNext w:val="0"/>
         <w:widowControl/>
@@ -1291,6 +1356,7 @@
           <w:lang w:val="en-GB" w:bidi="en-GB"/>
           <w:rtl w:val="0"/>
           <w:szCs w:val="21"/>
+          <w:bCs w:val="0"/>
         </w:rPr>
         <w:t>Please share the available information and documentation for our internal review, identifying confirmed details and items requiring further validation.</w:t>
       </w:r>
@@ -1312,13 +1378,14 @@
           <w:lang w:val="ar-SA" w:bidi="ar-SA"/>
           <w:rtl w:val="1"/>
           <w:szCs w:val="23"/>
+          <w:bCs w:val="0"/>
         </w:rPr>
         <w:t>وتفضلوا بقبول التحية،</w:t>
       </w:r>
     </w:p>
     <w:p>
       <w:pPr>
-        <w:spacing w:after="40" w:before="0" w:line="294" w:lineRule="exact"/>
+        <w:spacing w:after="40" w:before="0" w:line="336" w:lineRule="exact"/>
         <w:jc w:val="left"/>
         <w:keepNext/>
         <w:widowControl/>
@@ -1333,6 +1400,7 @@
           <w:lang w:val="en-GB" w:bidi="en-GB"/>
           <w:rtl w:val="0"/>
           <w:szCs w:val="21"/>
+          <w:bCs w:val="0"/>
         </w:rPr>
         <w:t>Yours sincerely,</w:t>
       </w:r>
@@ -1354,6 +1422,7 @@
           <w:lang w:val="ar-SA" w:bidi="ar-SA"/>
           <w:rtl w:val="1"/>
           <w:szCs w:val="18"/>
+          <w:bCs w:val="0"/>
         </w:rPr>
         <w:t>«التوقيع»</w:t>
       </w:r>
@@ -1369,13 +1438,13 @@
       <w:r>
         <w:rPr>
           <w:rFonts w:ascii="Noto Sans Arabic" w:hAnsi="Noto Sans Arabic" w:cs="Noto Sans Arabic" w:eastAsia="Noto Sans Arabic"/>
-          <w:b/>
+          <w:b w:val="0"/>
           <w:color w:val="12171D"/>
           <w:sz w:val="23"/>
           <w:lang w:val="ar-SA" w:bidi="ar-SA"/>
           <w:rtl w:val="1"/>
           <w:szCs w:val="23"/>
-          <w:bCs/>
+          <w:bCs w:val="0"/>
         </w:rPr>
         <w:t>«اسم الموقّع»</w:t>
         <w:br/>
@@ -1384,7 +1453,7 @@
     </w:p>
     <w:p>
       <w:pPr>
-        <w:spacing w:after="0" w:before="0" w:line="252" w:lineRule="exact"/>
+        <w:spacing w:after="0" w:before="0" w:line="288" w:lineRule="exact"/>
         <w:jc w:val="left"/>
         <w:keepNext w:val="0"/>
         <w:widowControl/>
@@ -1399,6 +1468,7 @@
           <w:lang w:val="en-GB" w:bidi="en-GB"/>
           <w:rtl w:val="0"/>
           <w:szCs w:val="18"/>
+          <w:bCs w:val="0"/>
         </w:rPr>
         <w:t>[SIGNATORY NAME] · [TITLE]</w:t>
       </w:r>
@@ -1419,7 +1489,7 @@
     </w:p>
     <w:p>
       <w:pPr>
-        <w:spacing w:after="180" w:before="0" w:line="210" w:lineRule="exact"/>
+        <w:spacing w:after="180" w:before="0" w:line="240" w:lineRule="exact"/>
         <w:jc w:val="left"/>
         <w:keepNext w:val="0"/>
         <w:widowControl/>
@@ -1434,13 +1504,14 @@
           <w:lang w:val="en-GB" w:bidi="en-GB"/>
           <w:rtl w:val="0"/>
           <w:szCs w:val="15"/>
+          <w:bCs w:val="0"/>
         </w:rPr>
         <w:t>SAMPLE CONTENT</w:t>
       </w:r>
     </w:p>
     <w:p>
       <w:pPr>
-        <w:spacing w:after="200" w:before="0" w:line="238" w:lineRule="exact"/>
+        <w:spacing w:after="200" w:before="0" w:line="272" w:lineRule="exact"/>
         <w:jc w:val="left"/>
         <w:keepNext w:val="0"/>
         <w:widowControl/>
@@ -1455,13 +1526,14 @@
           <w:lang w:val="en-GB" w:bidi="en-GB"/>
           <w:rtl w:val="0"/>
           <w:szCs w:val="17"/>
+          <w:bCs w:val="0"/>
         </w:rPr>
         <w:t>Date: [DATE]    Reference: [REFERENCE NUMBER]</w:t>
       </w:r>
     </w:p>
     <w:p>
       <w:pPr>
-        <w:spacing w:after="200" w:before="0" w:line="294" w:lineRule="exact"/>
+        <w:spacing w:after="200" w:before="0" w:line="336" w:lineRule="exact"/>
         <w:jc w:val="left"/>
         <w:keepNext/>
         <w:widowControl/>
@@ -1476,6 +1548,7 @@
           <w:lang w:val="en-GB" w:bidi="en-GB"/>
           <w:rtl w:val="0"/>
           <w:szCs w:val="21"/>
+          <w:bCs w:val="0"/>
         </w:rPr>
         <w:t>[RECIPIENT NAME]</w:t>
         <w:br/>
@@ -1489,7 +1562,7 @@
     <w:p>
       <w:pPr>
         <w:pStyle w:val="Heading1"/>
-        <w:spacing w:after="240" w:before="0" w:line="336" w:lineRule="exact"/>
+        <w:spacing w:after="240" w:before="0" w:line="384" w:lineRule="exact"/>
         <w:jc w:val="left"/>
         <w:keepNext/>
         <w:widowControl/>
@@ -1498,19 +1571,20 @@
       <w:r>
         <w:rPr>
           <w:rFonts w:ascii="Jost" w:hAnsi="Jost" w:cs="Jost" w:eastAsia="Jost"/>
-          <w:b/>
+          <w:b w:val="0"/>
           <w:color w:val="12171D"/>
           <w:sz w:val="24"/>
           <w:lang w:val="en-GB" w:bidi="en-GB"/>
           <w:rtl w:val="0"/>
           <w:szCs w:val="24"/>
+          <w:bCs w:val="0"/>
         </w:rPr>
         <w:t>Formal correspondence regarding the proposed review</w:t>
       </w:r>
     </w:p>
     <w:p>
       <w:pPr>
-        <w:spacing w:after="200" w:before="0" w:line="294" w:lineRule="exact"/>
+        <w:spacing w:after="200" w:before="0" w:line="336" w:lineRule="exact"/>
         <w:jc w:val="left"/>
         <w:keepNext w:val="0"/>
         <w:widowControl/>
@@ -1525,13 +1599,16 @@
           <w:lang w:val="en-GB" w:bidi="en-GB"/>
           <w:rtl w:val="0"/>
           <w:szCs w:val="21"/>
+          <w:bCs w:val="0"/>
         </w:rPr>
         <w:t>Dear [RECIPIENT NAME],</w:t>
       </w:r>
     </w:p>
     <w:p>
       <w:pPr>
-        <w:spacing w:after="120" w:before="0" w:line="294" w:lineRule="exact"/>
+        <w:pStyle w:val="BodyText"/>
+        <w:spacing w:after="120" w:before="0" w:line="336" w:lineRule="exact"/>
+        <w:ind w:right="1701"/>
         <w:jc w:val="left"/>
         <w:keepNext w:val="0"/>
         <w:widowControl/>
@@ -1546,13 +1623,16 @@
           <w:lang w:val="en-GB" w:bidi="en-GB"/>
           <w:rtl w:val="0"/>
           <w:szCs w:val="21"/>
+          <w:bCs w:val="0"/>
         </w:rPr>
         <w:t>We request your review of the accompanying information before a formal response is prepared. Please identify any points that need clarification and the appropriate person to coordinate the review.</w:t>
       </w:r>
     </w:p>
     <w:p>
       <w:pPr>
-        <w:spacing w:after="120" w:before="0" w:line="294" w:lineRule="exact"/>
+        <w:pStyle w:val="BodyText"/>
+        <w:spacing w:after="120" w:before="0" w:line="336" w:lineRule="exact"/>
+        <w:ind w:right="1701"/>
         <w:jc w:val="left"/>
         <w:keepNext w:val="0"/>
         <w:widowControl/>
@@ -1567,13 +1647,14 @@
           <w:lang w:val="en-GB" w:bidi="en-GB"/>
           <w:rtl w:val="0"/>
           <w:szCs w:val="21"/>
+          <w:bCs w:val="0"/>
         </w:rPr>
         <w:t>This letter is sample administrative correspondence. It records no decision, obligation, approval or contractual commitment.</w:t>
       </w:r>
     </w:p>
     <w:p>
       <w:pPr>
-        <w:spacing w:after="80" w:before="200" w:line="294" w:lineRule="exact"/>
+        <w:spacing w:after="80" w:before="200" w:line="336" w:lineRule="exact"/>
         <w:jc w:val="left"/>
         <w:keepNext/>
         <w:widowControl/>
@@ -1588,13 +1669,14 @@
           <w:lang w:val="en-GB" w:bidi="en-GB"/>
           <w:rtl w:val="0"/>
           <w:szCs w:val="21"/>
+          <w:bCs w:val="0"/>
         </w:rPr>
         <w:t>Yours sincerely,</w:t>
       </w:r>
     </w:p>
     <w:p>
       <w:pPr>
-        <w:spacing w:after="80" w:before="907" w:line="224" w:lineRule="exact"/>
+        <w:spacing w:after="80" w:before="907" w:line="256" w:lineRule="exact"/>
         <w:jc w:val="left"/>
         <w:keepNext/>
         <w:widowControl/>
@@ -1609,13 +1691,14 @@
           <w:lang w:val="en-GB" w:bidi="en-GB"/>
           <w:rtl w:val="0"/>
           <w:szCs w:val="16"/>
+          <w:bCs w:val="0"/>
         </w:rPr>
         <w:t>[SIGNATURE]</w:t>
       </w:r>
     </w:p>
     <w:p>
       <w:pPr>
-        <w:spacing w:after="0" w:before="0" w:line="294" w:lineRule="exact"/>
+        <w:spacing w:after="0" w:before="0" w:line="336" w:lineRule="exact"/>
         <w:jc w:val="left"/>
         <w:keepNext w:val="0"/>
         <w:widowControl/>
@@ -1624,12 +1707,13 @@
       <w:r>
         <w:rPr>
           <w:rFonts w:ascii="Inter" w:hAnsi="Inter" w:cs="Inter" w:eastAsia="Inter"/>
-          <w:b/>
+          <w:b w:val="0"/>
           <w:color w:val="12171D"/>
           <w:sz w:val="21"/>
           <w:lang w:val="en-GB" w:bidi="en-GB"/>
           <w:rtl w:val="0"/>
           <w:szCs w:val="21"/>
+          <w:bCs w:val="0"/>
         </w:rPr>
         <w:t>[SIGNATORY NAME]</w:t>
         <w:br/>
@@ -1653,7 +1737,7 @@
     </w:p>
     <w:p>
       <w:pPr>
-        <w:spacing w:after="180" w:before="0" w:line="210" w:lineRule="exact"/>
+        <w:spacing w:after="180" w:before="0" w:line="240" w:lineRule="exact"/>
         <w:jc w:val="left"/>
         <w:keepNext w:val="0"/>
         <w:widowControl/>
@@ -1668,13 +1752,14 @@
           <w:lang w:val="en-GB" w:bidi="en-GB"/>
           <w:rtl w:val="0"/>
           <w:szCs w:val="15"/>
+          <w:bCs w:val="0"/>
         </w:rPr>
         <w:t>SAMPLE CONTENT</w:t>
       </w:r>
     </w:p>
     <w:p>
       <w:pPr>
-        <w:spacing w:after="200" w:before="0" w:line="238" w:lineRule="exact"/>
+        <w:spacing w:after="200" w:before="0" w:line="272" w:lineRule="exact"/>
         <w:jc w:val="left"/>
         <w:keepNext w:val="0"/>
         <w:widowControl/>
@@ -1689,13 +1774,14 @@
           <w:lang w:val="en-GB" w:bidi="en-GB"/>
           <w:rtl w:val="0"/>
           <w:szCs w:val="17"/>
+          <w:bCs w:val="0"/>
         </w:rPr>
         <w:t>Date: [DATE]    Reference: [REFERENCE NUMBER]</w:t>
       </w:r>
     </w:p>
     <w:p>
       <w:pPr>
-        <w:spacing w:after="200" w:before="0" w:line="294" w:lineRule="exact"/>
+        <w:spacing w:after="200" w:before="0" w:line="336" w:lineRule="exact"/>
         <w:jc w:val="left"/>
         <w:keepNext/>
         <w:widowControl/>
@@ -1710,6 +1796,7 @@
           <w:lang w:val="en-GB" w:bidi="en-GB"/>
           <w:rtl w:val="0"/>
           <w:szCs w:val="21"/>
+          <w:bCs w:val="0"/>
         </w:rPr>
         <w:t>[RECIPIENT NAME]</w:t>
         <w:br/>
@@ -1723,7 +1810,7 @@
     <w:p>
       <w:pPr>
         <w:pStyle w:val="Heading1"/>
-        <w:spacing w:after="240" w:before="0" w:line="336" w:lineRule="exact"/>
+        <w:spacing w:after="240" w:before="0" w:line="384" w:lineRule="exact"/>
         <w:jc w:val="left"/>
         <w:keepNext/>
         <w:widowControl/>
@@ -1732,19 +1819,20 @@
       <w:r>
         <w:rPr>
           <w:rFonts w:ascii="Jost" w:hAnsi="Jost" w:cs="Jost" w:eastAsia="Jost"/>
-          <w:b/>
+          <w:b w:val="0"/>
           <w:color w:val="12171D"/>
           <w:sz w:val="24"/>
           <w:lang w:val="en-GB" w:bidi="en-GB"/>
           <w:rtl w:val="0"/>
           <w:szCs w:val="24"/>
+          <w:bCs w:val="0"/>
         </w:rPr>
         <w:t>Request for supplier information and product documentation</w:t>
       </w:r>
     </w:p>
     <w:p>
       <w:pPr>
-        <w:spacing w:after="200" w:before="0" w:line="294" w:lineRule="exact"/>
+        <w:spacing w:after="200" w:before="0" w:line="336" w:lineRule="exact"/>
         <w:jc w:val="left"/>
         <w:keepNext w:val="0"/>
         <w:widowControl/>
@@ -1759,13 +1847,16 @@
           <w:lang w:val="en-GB" w:bidi="en-GB"/>
           <w:rtl w:val="0"/>
           <w:szCs w:val="21"/>
+          <w:bCs w:val="0"/>
         </w:rPr>
         <w:t>Dear [RECIPIENT NAME],</w:t>
       </w:r>
     </w:p>
     <w:p>
       <w:pPr>
-        <w:spacing w:after="120" w:before="0" w:line="294" w:lineRule="exact"/>
+        <w:pStyle w:val="BodyText"/>
+        <w:spacing w:after="120" w:before="0" w:line="336" w:lineRule="exact"/>
+        <w:ind w:right="1701"/>
         <w:jc w:val="left"/>
         <w:keepNext w:val="0"/>
         <w:widowControl/>
@@ -1780,13 +1871,16 @@
           <w:lang w:val="en-GB" w:bidi="en-GB"/>
           <w:rtl w:val="0"/>
           <w:szCs w:val="21"/>
+          <w:bCs w:val="0"/>
         </w:rPr>
         <w:t>Please share the available product information and supporting documentation for our internal review. Indicate which details are confirmed and which require further validation.</w:t>
       </w:r>
     </w:p>
     <w:p>
       <w:pPr>
-        <w:spacing w:after="120" w:before="0" w:line="294" w:lineRule="exact"/>
+        <w:pStyle w:val="BodyText"/>
+        <w:spacing w:after="120" w:before="0" w:line="336" w:lineRule="exact"/>
+        <w:ind w:right="1701"/>
         <w:jc w:val="left"/>
         <w:keepNext w:val="0"/>
         <w:widowControl/>
@@ -1801,13 +1895,14 @@
           <w:lang w:val="en-GB" w:bidi="en-GB"/>
           <w:rtl w:val="0"/>
           <w:szCs w:val="21"/>
+          <w:bCs w:val="0"/>
         </w:rPr>
         <w:t>We would welcome a concise response identifying the relevant contact and any information needed from us. This sample does not create a commercial commitment or confirm a supplier relationship.</w:t>
       </w:r>
     </w:p>
     <w:p>
       <w:pPr>
-        <w:spacing w:after="80" w:before="200" w:line="294" w:lineRule="exact"/>
+        <w:spacing w:after="80" w:before="200" w:line="336" w:lineRule="exact"/>
         <w:jc w:val="left"/>
         <w:keepNext/>
         <w:widowControl/>
@@ -1822,13 +1917,14 @@
           <w:lang w:val="en-GB" w:bidi="en-GB"/>
           <w:rtl w:val="0"/>
           <w:szCs w:val="21"/>
+          <w:bCs w:val="0"/>
         </w:rPr>
         <w:t>Yours sincerely,</w:t>
       </w:r>
     </w:p>
     <w:p>
       <w:pPr>
-        <w:spacing w:after="80" w:before="907" w:line="224" w:lineRule="exact"/>
+        <w:spacing w:after="80" w:before="907" w:line="256" w:lineRule="exact"/>
         <w:jc w:val="left"/>
         <w:keepNext/>
         <w:widowControl/>
@@ -1843,13 +1939,14 @@
           <w:lang w:val="en-GB" w:bidi="en-GB"/>
           <w:rtl w:val="0"/>
           <w:szCs w:val="16"/>
+          <w:bCs w:val="0"/>
         </w:rPr>
         <w:t>[SIGNATURE]</w:t>
       </w:r>
     </w:p>
     <w:p>
       <w:pPr>
-        <w:spacing w:after="0" w:before="0" w:line="294" w:lineRule="exact"/>
+        <w:spacing w:after="0" w:before="0" w:line="336" w:lineRule="exact"/>
         <w:jc w:val="left"/>
         <w:keepNext w:val="0"/>
         <w:widowControl/>
@@ -1858,12 +1955,13 @@
       <w:r>
         <w:rPr>
           <w:rFonts w:ascii="Inter" w:hAnsi="Inter" w:cs="Inter" w:eastAsia="Inter"/>
-          <w:b/>
+          <w:b w:val="0"/>
           <w:color w:val="12171D"/>
           <w:sz w:val="21"/>
           <w:lang w:val="en-GB" w:bidi="en-GB"/>
           <w:rtl w:val="0"/>
           <w:szCs w:val="21"/>
+          <w:bCs w:val="0"/>
         </w:rPr>
         <w:t>[SIGNATORY NAME]</w:t>
         <w:br/>
@@ -1889,6 +1987,7 @@
 <w:ftr xmlns:m="http://schemas.openxmlformats.org/officeDocument/2006/math" xmlns:mc="http://schemas.openxmlformats.org/markup-compatibility/2006" xmlns:mo="http://schemas.microsoft.com/office/mac/office/2008/main" xmlns:mv="urn:schemas-microsoft-com:mac:vml" xmlns:o="urn:schemas-microsoft-com:office:office" xmlns:r="http://schemas.openxmlformats.org/officeDocument/2006/relationships" xmlns:v="urn:schemas-microsoft-com:vml" xmlns:w10="urn:schemas-microsoft-com:office:word" xmlns:w14="http://schemas.microsoft.com/office/word/2010/wordml" xmlns:w="http://schemas.openxmlformats.org/wordprocessingml/2006/main" xmlns:wne="http://schemas.microsoft.com/office/word/2006/wordml" xmlns:wp14="http://schemas.microsoft.com/office/word/2010/wordprocessingDrawing" xmlns:wp="http://schemas.openxmlformats.org/drawingml/2006/wordprocessingDrawing" xmlns:wpc="http://schemas.microsoft.com/office/word/2010/wordprocessingCanvas" xmlns:wpg="http://schemas.microsoft.com/office/word/2010/wordprocessingGroup" xmlns:wpi="http://schemas.microsoft.com/office/word/2010/wordprocessingInk" xmlns:wps="http://schemas.microsoft.com/office/word/2010/wordprocessingShape" mc:Ignorable="w14 wp14">
   <w:p>
     <w:pPr>
+      <w:bidi w:val="0"/>
       <w:spacing w:after="80"/>
       <w:jc w:val="left"/>
       <w:pBdr>
@@ -1904,12 +2003,14 @@
         <w:lang w:val="en-GB" w:bidi="en-GB"/>
         <w:rtl w:val="0"/>
         <w:szCs w:val="15"/>
+        <w:bCs w:val="0"/>
       </w:rPr>
       <w:t>GEM™   [ADDRESS] · [CITY] · [COUNTRY] · [POSTAL CODE]</w:t>
     </w:r>
   </w:p>
   <w:p>
     <w:pPr>
+      <w:bidi w:val="0"/>
       <w:spacing w:after="120"/>
       <w:jc w:val="left"/>
     </w:pPr>
@@ -1922,6 +2023,7 @@
         <w:lang w:val="en-GB" w:bidi="en-GB"/>
         <w:rtl w:val="0"/>
         <w:szCs w:val="15"/>
+        <w:bCs w:val="0"/>
       </w:rPr>
       <w:t>[T]   [E]   [W]</w:t>
     </w:r>
@@ -1934,6 +2036,7 @@
         <w:lang w:val="en-GB" w:bidi="en-GB"/>
         <w:rtl w:val="0"/>
         <w:szCs w:val="15"/>
+        <w:bCs w:val="0"/>
       </w:rPr>
       <w:t xml:space="preserve">     Page </w:t>
     </w:r>
@@ -1956,6 +2059,7 @@
         <w:lang w:val="en-GB" w:bidi="en-GB"/>
         <w:rtl w:val="0"/>
         <w:szCs w:val="15"/>
+        <w:bCs w:val="0"/>
       </w:rPr>
       <w:t xml:space="preserve"> of </w:t>
     </w:r>
@@ -1972,6 +2076,7 @@
   </w:p>
   <w:p>
     <w:pPr>
+      <w:bidi w:val="0"/>
       <w:jc w:val="left"/>
     </w:pPr>
     <w:r>
@@ -1983,6 +2088,7 @@
         <w:lang w:val="en-GB" w:bidi="en-GB"/>
         <w:rtl w:val="0"/>
         <w:szCs w:val="13"/>
+        <w:bCs w:val="0"/>
       </w:rPr>
       <w:t>WORKING APPLICATION / PENDING VALIDATION</w:t>
     </w:r>
@@ -1994,6 +2100,7 @@
 <w:ftr xmlns:m="http://schemas.openxmlformats.org/officeDocument/2006/math" xmlns:mc="http://schemas.openxmlformats.org/markup-compatibility/2006" xmlns:mo="http://schemas.microsoft.com/office/mac/office/2008/main" xmlns:mv="urn:schemas-microsoft-com:mac:vml" xmlns:o="urn:schemas-microsoft-com:office:office" xmlns:r="http://schemas.openxmlformats.org/officeDocument/2006/relationships" xmlns:v="urn:schemas-microsoft-com:vml" xmlns:w10="urn:schemas-microsoft-com:office:word" xmlns:w14="http://schemas.microsoft.com/office/word/2010/wordml" xmlns:w="http://schemas.openxmlformats.org/wordprocessingml/2006/main" xmlns:wne="http://schemas.microsoft.com/office/word/2006/wordml" xmlns:wp14="http://schemas.microsoft.com/office/word/2010/wordprocessingDrawing" xmlns:wp="http://schemas.openxmlformats.org/drawingml/2006/wordprocessingDrawing" xmlns:wpc="http://schemas.microsoft.com/office/word/2010/wordprocessingCanvas" xmlns:wpg="http://schemas.microsoft.com/office/word/2010/wordprocessingGroup" xmlns:wpi="http://schemas.microsoft.com/office/word/2010/wordprocessingInk" xmlns:wps="http://schemas.microsoft.com/office/word/2010/wordprocessingShape" mc:Ignorable="w14 wp14">
   <w:p>
     <w:pPr>
+      <w:bidi w:val="0"/>
       <w:spacing w:after="80"/>
       <w:jc w:val="right"/>
       <w:pBdr>
@@ -2009,12 +2116,14 @@
         <w:lang w:val="en-GB" w:bidi="en-GB"/>
         <w:rtl w:val="0"/>
         <w:szCs w:val="15"/>
+        <w:bCs w:val="0"/>
       </w:rPr>
       <w:t>GEM™   [ADDRESS] · [CITY] · [COUNTRY] · [POSTAL CODE]</w:t>
     </w:r>
   </w:p>
   <w:p>
     <w:pPr>
+      <w:bidi w:val="0"/>
       <w:spacing w:after="120"/>
       <w:jc w:val="right"/>
     </w:pPr>
@@ -2027,6 +2136,7 @@
         <w:lang w:val="en-GB" w:bidi="en-GB"/>
         <w:rtl w:val="0"/>
         <w:szCs w:val="15"/>
+        <w:bCs w:val="0"/>
       </w:rPr>
       <w:t>[T]   [E]   [W]</w:t>
     </w:r>
@@ -2039,6 +2149,7 @@
         <w:lang w:val="en-GB" w:bidi="en-GB"/>
         <w:rtl w:val="0"/>
         <w:szCs w:val="15"/>
+        <w:bCs w:val="0"/>
       </w:rPr>
       <w:t xml:space="preserve">     Page </w:t>
     </w:r>
@@ -2061,6 +2172,7 @@
         <w:lang w:val="en-GB" w:bidi="en-GB"/>
         <w:rtl w:val="0"/>
         <w:szCs w:val="15"/>
+        <w:bCs w:val="0"/>
       </w:rPr>
       <w:t xml:space="preserve"> of </w:t>
     </w:r>
@@ -2077,6 +2189,7 @@
   </w:p>
   <w:p>
     <w:pPr>
+      <w:bidi w:val="0"/>
       <w:jc w:val="right"/>
     </w:pPr>
     <w:r>
@@ -2088,6 +2201,7 @@
         <w:lang w:val="en-GB" w:bidi="en-GB"/>
         <w:rtl w:val="0"/>
         <w:szCs w:val="13"/>
+        <w:bCs w:val="0"/>
       </w:rPr>
       <w:t>WORKING APPLICATION / PENDING VALIDATION</w:t>
     </w:r>
@@ -2099,6 +2213,7 @@
 <w:ftr xmlns:m="http://schemas.openxmlformats.org/officeDocument/2006/math" xmlns:mc="http://schemas.openxmlformats.org/markup-compatibility/2006" xmlns:mo="http://schemas.microsoft.com/office/mac/office/2008/main" xmlns:mv="urn:schemas-microsoft-com:mac:vml" xmlns:o="urn:schemas-microsoft-com:office:office" xmlns:r="http://schemas.openxmlformats.org/officeDocument/2006/relationships" xmlns:v="urn:schemas-microsoft-com:vml" xmlns:w10="urn:schemas-microsoft-com:office:word" xmlns:w14="http://schemas.microsoft.com/office/word/2010/wordml" xmlns:w="http://schemas.openxmlformats.org/wordprocessingml/2006/main" xmlns:wne="http://schemas.microsoft.com/office/word/2006/wordml" xmlns:wp14="http://schemas.microsoft.com/office/word/2010/wordprocessingDrawing" xmlns:wp="http://schemas.openxmlformats.org/drawingml/2006/wordprocessingDrawing" xmlns:wpc="http://schemas.microsoft.com/office/word/2010/wordprocessingCanvas" xmlns:wpg="http://schemas.microsoft.com/office/word/2010/wordprocessingGroup" xmlns:wpi="http://schemas.microsoft.com/office/word/2010/wordprocessingInk" xmlns:wps="http://schemas.microsoft.com/office/word/2010/wordprocessingShape" mc:Ignorable="w14 wp14">
   <w:p>
     <w:pPr>
+      <w:bidi w:val="0"/>
       <w:spacing w:after="80"/>
       <w:jc w:val="right"/>
       <w:pBdr>
@@ -2114,12 +2229,14 @@
         <w:lang w:val="en-GB" w:bidi="en-GB"/>
         <w:rtl w:val="0"/>
         <w:szCs w:val="15"/>
+        <w:bCs w:val="0"/>
       </w:rPr>
       <w:t>GEM™   [ADDRESS] · [CITY] · [COUNTRY] · [POSTAL CODE]</w:t>
     </w:r>
   </w:p>
   <w:p>
     <w:pPr>
+      <w:bidi w:val="0"/>
       <w:spacing w:after="120"/>
       <w:jc w:val="right"/>
     </w:pPr>
@@ -2132,6 +2249,7 @@
         <w:lang w:val="en-GB" w:bidi="en-GB"/>
         <w:rtl w:val="0"/>
         <w:szCs w:val="15"/>
+        <w:bCs w:val="0"/>
       </w:rPr>
       <w:t>[T]   [E]   [W]</w:t>
     </w:r>
@@ -2144,6 +2262,7 @@
         <w:lang w:val="en-GB" w:bidi="en-GB"/>
         <w:rtl w:val="0"/>
         <w:szCs w:val="15"/>
+        <w:bCs w:val="0"/>
       </w:rPr>
       <w:t xml:space="preserve">     Page </w:t>
     </w:r>
@@ -2166,6 +2285,7 @@
         <w:lang w:val="en-GB" w:bidi="en-GB"/>
         <w:rtl w:val="0"/>
         <w:szCs w:val="15"/>
+        <w:bCs w:val="0"/>
       </w:rPr>
       <w:t xml:space="preserve"> of </w:t>
     </w:r>
@@ -2182,6 +2302,7 @@
   </w:p>
   <w:p>
     <w:pPr>
+      <w:bidi w:val="0"/>
       <w:jc w:val="right"/>
     </w:pPr>
     <w:r>
@@ -2193,6 +2314,7 @@
         <w:lang w:val="en-GB" w:bidi="en-GB"/>
         <w:rtl w:val="0"/>
         <w:szCs w:val="13"/>
+        <w:bCs w:val="0"/>
       </w:rPr>
       <w:t>WORKING APPLICATION / PENDING VALIDATION</w:t>
     </w:r>
@@ -2210,6 +2332,7 @@
 <w:ftr xmlns:m="http://schemas.openxmlformats.org/officeDocument/2006/math" xmlns:mc="http://schemas.openxmlformats.org/markup-compatibility/2006" xmlns:mo="http://schemas.microsoft.com/office/mac/office/2008/main" xmlns:mv="urn:schemas-microsoft-com:mac:vml" xmlns:o="urn:schemas-microsoft-com:office:office" xmlns:r="http://schemas.openxmlformats.org/officeDocument/2006/relationships" xmlns:v="urn:schemas-microsoft-com:vml" xmlns:w10="urn:schemas-microsoft-com:office:word" xmlns:w14="http://schemas.microsoft.com/office/word/2010/wordml" xmlns:w="http://schemas.openxmlformats.org/wordprocessingml/2006/main" xmlns:wne="http://schemas.microsoft.com/office/word/2006/wordml" xmlns:wp14="http://schemas.microsoft.com/office/word/2010/wordprocessingDrawing" xmlns:wp="http://schemas.openxmlformats.org/drawingml/2006/wordprocessingDrawing" xmlns:wpc="http://schemas.microsoft.com/office/word/2010/wordprocessingCanvas" xmlns:wpg="http://schemas.microsoft.com/office/word/2010/wordprocessingGroup" xmlns:wpi="http://schemas.microsoft.com/office/word/2010/wordprocessingInk" xmlns:wps="http://schemas.microsoft.com/office/word/2010/wordprocessingShape" mc:Ignorable="w14 wp14">
   <w:p>
     <w:pPr>
+      <w:bidi w:val="0"/>
       <w:spacing w:after="80"/>
       <w:jc w:val="left"/>
       <w:pBdr>
@@ -2225,12 +2348,14 @@
         <w:lang w:val="en-GB" w:bidi="en-GB"/>
         <w:rtl w:val="0"/>
         <w:szCs w:val="15"/>
+        <w:bCs w:val="0"/>
       </w:rPr>
       <w:t>GEM™   [ADDRESS] · [CITY] · [COUNTRY] · [POSTAL CODE]</w:t>
     </w:r>
   </w:p>
   <w:p>
     <w:pPr>
+      <w:bidi w:val="0"/>
       <w:spacing w:after="120"/>
       <w:jc w:val="left"/>
     </w:pPr>
@@ -2243,6 +2368,7 @@
         <w:lang w:val="en-GB" w:bidi="en-GB"/>
         <w:rtl w:val="0"/>
         <w:szCs w:val="15"/>
+        <w:bCs w:val="0"/>
       </w:rPr>
       <w:t>[T]   [E]   [W]</w:t>
     </w:r>
@@ -2255,6 +2381,7 @@
         <w:lang w:val="en-GB" w:bidi="en-GB"/>
         <w:rtl w:val="0"/>
         <w:szCs w:val="15"/>
+        <w:bCs w:val="0"/>
       </w:rPr>
       <w:t xml:space="preserve">     Page </w:t>
     </w:r>
@@ -2277,6 +2404,7 @@
         <w:lang w:val="en-GB" w:bidi="en-GB"/>
         <w:rtl w:val="0"/>
         <w:szCs w:val="15"/>
+        <w:bCs w:val="0"/>
       </w:rPr>
       <w:t xml:space="preserve"> of </w:t>
     </w:r>
@@ -2293,6 +2421,7 @@
   </w:p>
   <w:p>
     <w:pPr>
+      <w:bidi w:val="0"/>
       <w:jc w:val="left"/>
     </w:pPr>
     <w:r>
@@ -2304,6 +2433,7 @@
         <w:lang w:val="en-GB" w:bidi="en-GB"/>
         <w:rtl w:val="0"/>
         <w:szCs w:val="13"/>
+        <w:bCs w:val="0"/>
       </w:rPr>
       <w:t>WORKING APPLICATION / PENDING VALIDATION</w:t>
     </w:r>
@@ -2315,6 +2445,7 @@
 <w:ftr xmlns:m="http://schemas.openxmlformats.org/officeDocument/2006/math" xmlns:mc="http://schemas.openxmlformats.org/markup-compatibility/2006" xmlns:mo="http://schemas.microsoft.com/office/mac/office/2008/main" xmlns:mv="urn:schemas-microsoft-com:mac:vml" xmlns:o="urn:schemas-microsoft-com:office:office" xmlns:r="http://schemas.openxmlformats.org/officeDocument/2006/relationships" xmlns:v="urn:schemas-microsoft-com:vml" xmlns:w10="urn:schemas-microsoft-com:office:word" xmlns:w14="http://schemas.microsoft.com/office/word/2010/wordml" xmlns:w="http://schemas.openxmlformats.org/wordprocessingml/2006/main" xmlns:wne="http://schemas.microsoft.com/office/word/2006/wordml" xmlns:wp14="http://schemas.microsoft.com/office/word/2010/wordprocessingDrawing" xmlns:wp="http://schemas.openxmlformats.org/drawingml/2006/wordprocessingDrawing" xmlns:wpc="http://schemas.microsoft.com/office/word/2010/wordprocessingCanvas" xmlns:wpg="http://schemas.microsoft.com/office/word/2010/wordprocessingGroup" xmlns:wpi="http://schemas.microsoft.com/office/word/2010/wordprocessingInk" xmlns:wps="http://schemas.microsoft.com/office/word/2010/wordprocessingShape" mc:Ignorable="w14 wp14">
   <w:p>
     <w:pPr>
+      <w:bidi w:val="0"/>
       <w:spacing w:after="80"/>
       <w:jc w:val="left"/>
       <w:pBdr>
@@ -2330,12 +2461,14 @@
         <w:lang w:val="en-GB" w:bidi="en-GB"/>
         <w:rtl w:val="0"/>
         <w:szCs w:val="15"/>
+        <w:bCs w:val="0"/>
       </w:rPr>
       <w:t>GEM™   [ADDRESS] · [CITY] · [COUNTRY] · [POSTAL CODE]</w:t>
     </w:r>
   </w:p>
   <w:p>
     <w:pPr>
+      <w:bidi w:val="0"/>
       <w:spacing w:after="120"/>
       <w:jc w:val="left"/>
     </w:pPr>
@@ -2348,6 +2481,7 @@
         <w:lang w:val="en-GB" w:bidi="en-GB"/>
         <w:rtl w:val="0"/>
         <w:szCs w:val="15"/>
+        <w:bCs w:val="0"/>
       </w:rPr>
       <w:t>[T]   [E]   [W]</w:t>
     </w:r>
@@ -2360,6 +2494,7 @@
         <w:lang w:val="en-GB" w:bidi="en-GB"/>
         <w:rtl w:val="0"/>
         <w:szCs w:val="15"/>
+        <w:bCs w:val="0"/>
       </w:rPr>
       <w:t xml:space="preserve">     Page </w:t>
     </w:r>
@@ -2382,6 +2517,7 @@
         <w:lang w:val="en-GB" w:bidi="en-GB"/>
         <w:rtl w:val="0"/>
         <w:szCs w:val="15"/>
+        <w:bCs w:val="0"/>
       </w:rPr>
       <w:t xml:space="preserve"> of </w:t>
     </w:r>
@@ -2398,6 +2534,7 @@
   </w:p>
   <w:p>
     <w:pPr>
+      <w:bidi w:val="0"/>
       <w:jc w:val="left"/>
     </w:pPr>
     <w:r>
@@ -2409,6 +2546,7 @@
         <w:lang w:val="en-GB" w:bidi="en-GB"/>
         <w:rtl w:val="0"/>
         <w:szCs w:val="13"/>
+        <w:bCs w:val="0"/>
       </w:rPr>
       <w:t>WORKING APPLICATION / PENDING VALIDATION</w:t>
     </w:r>
@@ -2420,6 +2558,7 @@
 <w:ftr xmlns:m="http://schemas.openxmlformats.org/officeDocument/2006/math" xmlns:mc="http://schemas.openxmlformats.org/markup-compatibility/2006" xmlns:mo="http://schemas.microsoft.com/office/mac/office/2008/main" xmlns:mv="urn:schemas-microsoft-com:mac:vml" xmlns:o="urn:schemas-microsoft-com:office:office" xmlns:r="http://schemas.openxmlformats.org/officeDocument/2006/relationships" xmlns:v="urn:schemas-microsoft-com:vml" xmlns:w10="urn:schemas-microsoft-com:office:word" xmlns:w14="http://schemas.microsoft.com/office/word/2010/wordml" xmlns:w="http://schemas.openxmlformats.org/wordprocessingml/2006/main" xmlns:wne="http://schemas.microsoft.com/office/word/2006/wordml" xmlns:wp14="http://schemas.microsoft.com/office/word/2010/wordprocessingDrawing" xmlns:wp="http://schemas.openxmlformats.org/drawingml/2006/wordprocessingDrawing" xmlns:wpc="http://schemas.microsoft.com/office/word/2010/wordprocessingCanvas" xmlns:wpg="http://schemas.microsoft.com/office/word/2010/wordprocessingGroup" xmlns:wpi="http://schemas.microsoft.com/office/word/2010/wordprocessingInk" xmlns:wps="http://schemas.microsoft.com/office/word/2010/wordprocessingShape" mc:Ignorable="w14 wp14">
   <w:p>
     <w:pPr>
+      <w:bidi w:val="0"/>
       <w:spacing w:after="80"/>
       <w:jc w:val="left"/>
       <w:pBdr>
@@ -2435,12 +2574,14 @@
         <w:lang w:val="en-GB" w:bidi="en-GB"/>
         <w:rtl w:val="0"/>
         <w:szCs w:val="15"/>
+        <w:bCs w:val="0"/>
       </w:rPr>
       <w:t>GEM™   [ADDRESS] · [CITY] · [COUNTRY] · [POSTAL CODE]</w:t>
     </w:r>
   </w:p>
   <w:p>
     <w:pPr>
+      <w:bidi w:val="0"/>
       <w:spacing w:after="120"/>
       <w:jc w:val="left"/>
     </w:pPr>
@@ -2453,6 +2594,7 @@
         <w:lang w:val="en-GB" w:bidi="en-GB"/>
         <w:rtl w:val="0"/>
         <w:szCs w:val="15"/>
+        <w:bCs w:val="0"/>
       </w:rPr>
       <w:t>[T]   [E]   [W]</w:t>
     </w:r>
@@ -2465,6 +2607,7 @@
         <w:lang w:val="en-GB" w:bidi="en-GB"/>
         <w:rtl w:val="0"/>
         <w:szCs w:val="15"/>
+        <w:bCs w:val="0"/>
       </w:rPr>
       <w:t xml:space="preserve">     Page </w:t>
     </w:r>
@@ -2487,6 +2630,7 @@
         <w:lang w:val="en-GB" w:bidi="en-GB"/>
         <w:rtl w:val="0"/>
         <w:szCs w:val="15"/>
+        <w:bCs w:val="0"/>
       </w:rPr>
       <w:t xml:space="preserve"> of </w:t>
     </w:r>
@@ -2503,6 +2647,7 @@
   </w:p>
   <w:p>
     <w:pPr>
+      <w:bidi w:val="0"/>
       <w:jc w:val="left"/>
     </w:pPr>
     <w:r>
@@ -2514,6 +2659,7 @@
         <w:lang w:val="en-GB" w:bidi="en-GB"/>
         <w:rtl w:val="0"/>
         <w:szCs w:val="13"/>
+        <w:bCs w:val="0"/>
       </w:rPr>
       <w:t>WORKING APPLICATION / PENDING VALIDATION</w:t>
     </w:r>
@@ -2525,6 +2671,7 @@
 <w:ftr xmlns:m="http://schemas.openxmlformats.org/officeDocument/2006/math" xmlns:mc="http://schemas.openxmlformats.org/markup-compatibility/2006" xmlns:mo="http://schemas.microsoft.com/office/mac/office/2008/main" xmlns:mv="urn:schemas-microsoft-com:mac:vml" xmlns:o="urn:schemas-microsoft-com:office:office" xmlns:r="http://schemas.openxmlformats.org/officeDocument/2006/relationships" xmlns:v="urn:schemas-microsoft-com:vml" xmlns:w10="urn:schemas-microsoft-com:office:word" xmlns:w14="http://schemas.microsoft.com/office/word/2010/wordml" xmlns:w="http://schemas.openxmlformats.org/wordprocessingml/2006/main" xmlns:wne="http://schemas.microsoft.com/office/word/2006/wordml" xmlns:wp14="http://schemas.microsoft.com/office/word/2010/wordprocessingDrawing" xmlns:wp="http://schemas.openxmlformats.org/drawingml/2006/wordprocessingDrawing" xmlns:wpc="http://schemas.microsoft.com/office/word/2010/wordprocessingCanvas" xmlns:wpg="http://schemas.microsoft.com/office/word/2010/wordprocessingGroup" xmlns:wpi="http://schemas.microsoft.com/office/word/2010/wordprocessingInk" xmlns:wps="http://schemas.microsoft.com/office/word/2010/wordprocessingShape" mc:Ignorable="w14 wp14">
   <w:p>
     <w:pPr>
+      <w:bidi w:val="0"/>
       <w:spacing w:after="80"/>
       <w:jc w:val="left"/>
       <w:pBdr>
@@ -2540,12 +2687,14 @@
         <w:lang w:val="en-GB" w:bidi="en-GB"/>
         <w:rtl w:val="0"/>
         <w:szCs w:val="15"/>
+        <w:bCs w:val="0"/>
       </w:rPr>
       <w:t>GEM™   [ADDRESS] · [CITY] · [COUNTRY] · [POSTAL CODE]</w:t>
     </w:r>
   </w:p>
   <w:p>
     <w:pPr>
+      <w:bidi w:val="0"/>
       <w:spacing w:after="120"/>
       <w:jc w:val="left"/>
     </w:pPr>
@@ -2558,6 +2707,7 @@
         <w:lang w:val="en-GB" w:bidi="en-GB"/>
         <w:rtl w:val="0"/>
         <w:szCs w:val="15"/>
+        <w:bCs w:val="0"/>
       </w:rPr>
       <w:t>[T]   [E]   [W]</w:t>
     </w:r>
@@ -2570,6 +2720,7 @@
         <w:lang w:val="en-GB" w:bidi="en-GB"/>
         <w:rtl w:val="0"/>
         <w:szCs w:val="15"/>
+        <w:bCs w:val="0"/>
       </w:rPr>
       <w:t xml:space="preserve">     Page </w:t>
     </w:r>
@@ -2592,6 +2743,7 @@
         <w:lang w:val="en-GB" w:bidi="en-GB"/>
         <w:rtl w:val="0"/>
         <w:szCs w:val="15"/>
+        <w:bCs w:val="0"/>
       </w:rPr>
       <w:t xml:space="preserve"> of </w:t>
     </w:r>
@@ -2608,6 +2760,7 @@
   </w:p>
   <w:p>
     <w:pPr>
+      <w:bidi w:val="0"/>
       <w:jc w:val="left"/>
     </w:pPr>
     <w:r>
@@ -2619,6 +2772,7 @@
         <w:lang w:val="en-GB" w:bidi="en-GB"/>
         <w:rtl w:val="0"/>
         <w:szCs w:val="13"/>
+        <w:bCs w:val="0"/>
       </w:rPr>
       <w:t>WORKING APPLICATION / PENDING VALIDATION</w:t>
     </w:r>
@@ -2630,6 +2784,7 @@
 <w:ftr xmlns:m="http://schemas.openxmlformats.org/officeDocument/2006/math" xmlns:mc="http://schemas.openxmlformats.org/markup-compatibility/2006" xmlns:mo="http://schemas.microsoft.com/office/mac/office/2008/main" xmlns:mv="urn:schemas-microsoft-com:mac:vml" xmlns:o="urn:schemas-microsoft-com:office:office" xmlns:r="http://schemas.openxmlformats.org/officeDocument/2006/relationships" xmlns:v="urn:schemas-microsoft-com:vml" xmlns:w10="urn:schemas-microsoft-com:office:word" xmlns:w14="http://schemas.microsoft.com/office/word/2010/wordml" xmlns:w="http://schemas.openxmlformats.org/wordprocessingml/2006/main" xmlns:wne="http://schemas.microsoft.com/office/word/2006/wordml" xmlns:wp14="http://schemas.microsoft.com/office/word/2010/wordprocessingDrawing" xmlns:wp="http://schemas.openxmlformats.org/drawingml/2006/wordprocessingDrawing" xmlns:wpc="http://schemas.microsoft.com/office/word/2010/wordprocessingCanvas" xmlns:wpg="http://schemas.microsoft.com/office/word/2010/wordprocessingGroup" xmlns:wpi="http://schemas.microsoft.com/office/word/2010/wordprocessingInk" xmlns:wps="http://schemas.microsoft.com/office/word/2010/wordprocessingShape" mc:Ignorable="w14 wp14">
   <w:p>
     <w:pPr>
+      <w:bidi w:val="0"/>
       <w:spacing w:after="80"/>
       <w:jc w:val="left"/>
       <w:pBdr>
@@ -2645,12 +2800,14 @@
         <w:lang w:val="en-GB" w:bidi="en-GB"/>
         <w:rtl w:val="0"/>
         <w:szCs w:val="15"/>
+        <w:bCs w:val="0"/>
       </w:rPr>
       <w:t>GEM™   [ADDRESS] · [CITY] · [COUNTRY] · [POSTAL CODE]</w:t>
     </w:r>
   </w:p>
   <w:p>
     <w:pPr>
+      <w:bidi w:val="0"/>
       <w:spacing w:after="120"/>
       <w:jc w:val="left"/>
     </w:pPr>
@@ -2663,6 +2820,7 @@
         <w:lang w:val="en-GB" w:bidi="en-GB"/>
         <w:rtl w:val="0"/>
         <w:szCs w:val="15"/>
+        <w:bCs w:val="0"/>
       </w:rPr>
       <w:t>[T]   [E]   [W]</w:t>
     </w:r>
@@ -2675,6 +2833,7 @@
         <w:lang w:val="en-GB" w:bidi="en-GB"/>
         <w:rtl w:val="0"/>
         <w:szCs w:val="15"/>
+        <w:bCs w:val="0"/>
       </w:rPr>
       <w:t xml:space="preserve">     Page </w:t>
     </w:r>
@@ -2697,6 +2856,7 @@
         <w:lang w:val="en-GB" w:bidi="en-GB"/>
         <w:rtl w:val="0"/>
         <w:szCs w:val="15"/>
+        <w:bCs w:val="0"/>
       </w:rPr>
       <w:t xml:space="preserve"> of </w:t>
     </w:r>
@@ -2713,6 +2873,7 @@
   </w:p>
   <w:p>
     <w:pPr>
+      <w:bidi w:val="0"/>
       <w:jc w:val="left"/>
     </w:pPr>
     <w:r>
@@ -2724,6 +2885,7 @@
         <w:lang w:val="en-GB" w:bidi="en-GB"/>
         <w:rtl w:val="0"/>
         <w:szCs w:val="13"/>
+        <w:bCs w:val="0"/>
       </w:rPr>
       <w:t>WORKING APPLICATION / PENDING VALIDATION</w:t>
     </w:r>
@@ -2735,6 +2897,7 @@
 <w:ftr xmlns:m="http://schemas.openxmlformats.org/officeDocument/2006/math" xmlns:mc="http://schemas.openxmlformats.org/markup-compatibility/2006" xmlns:mo="http://schemas.microsoft.com/office/mac/office/2008/main" xmlns:mv="urn:schemas-microsoft-com:mac:vml" xmlns:o="urn:schemas-microsoft-com:office:office" xmlns:r="http://schemas.openxmlformats.org/officeDocument/2006/relationships" xmlns:v="urn:schemas-microsoft-com:vml" xmlns:w10="urn:schemas-microsoft-com:office:word" xmlns:w14="http://schemas.microsoft.com/office/word/2010/wordml" xmlns:w="http://schemas.openxmlformats.org/wordprocessingml/2006/main" xmlns:wne="http://schemas.microsoft.com/office/word/2006/wordml" xmlns:wp14="http://schemas.microsoft.com/office/word/2010/wordprocessingDrawing" xmlns:wp="http://schemas.openxmlformats.org/drawingml/2006/wordprocessingDrawing" xmlns:wpc="http://schemas.microsoft.com/office/word/2010/wordprocessingCanvas" xmlns:wpg="http://schemas.microsoft.com/office/word/2010/wordprocessingGroup" xmlns:wpi="http://schemas.microsoft.com/office/word/2010/wordprocessingInk" xmlns:wps="http://schemas.microsoft.com/office/word/2010/wordprocessingShape" mc:Ignorable="w14 wp14">
   <w:p>
     <w:pPr>
+      <w:bidi w:val="0"/>
       <w:spacing w:after="80"/>
       <w:jc w:val="left"/>
       <w:pBdr>
@@ -2750,12 +2913,14 @@
         <w:lang w:val="en-GB" w:bidi="en-GB"/>
         <w:rtl w:val="0"/>
         <w:szCs w:val="15"/>
+        <w:bCs w:val="0"/>
       </w:rPr>
       <w:t>GEM™   [ADDRESS] · [CITY] · [COUNTRY] · [POSTAL CODE]</w:t>
     </w:r>
   </w:p>
   <w:p>
     <w:pPr>
+      <w:bidi w:val="0"/>
       <w:spacing w:after="120"/>
       <w:jc w:val="left"/>
     </w:pPr>
@@ -2768,6 +2933,7 @@
         <w:lang w:val="en-GB" w:bidi="en-GB"/>
         <w:rtl w:val="0"/>
         <w:szCs w:val="15"/>
+        <w:bCs w:val="0"/>
       </w:rPr>
       <w:t>[T]   [E]   [W]</w:t>
     </w:r>
@@ -2780,6 +2946,7 @@
         <w:lang w:val="en-GB" w:bidi="en-GB"/>
         <w:rtl w:val="0"/>
         <w:szCs w:val="15"/>
+        <w:bCs w:val="0"/>
       </w:rPr>
       <w:t xml:space="preserve">     Page </w:t>
     </w:r>
@@ -2802,6 +2969,7 @@
         <w:lang w:val="en-GB" w:bidi="en-GB"/>
         <w:rtl w:val="0"/>
         <w:szCs w:val="15"/>
+        <w:bCs w:val="0"/>
       </w:rPr>
       <w:t xml:space="preserve"> of </w:t>
     </w:r>
@@ -2818,6 +2986,7 @@
   </w:p>
   <w:p>
     <w:pPr>
+      <w:bidi w:val="0"/>
       <w:jc w:val="left"/>
     </w:pPr>
     <w:r>
@@ -2829,6 +2998,7 @@
         <w:lang w:val="en-GB" w:bidi="en-GB"/>
         <w:rtl w:val="0"/>
         <w:szCs w:val="13"/>
+        <w:bCs w:val="0"/>
       </w:rPr>
       <w:t>WORKING APPLICATION / PENDING VALIDATION</w:t>
     </w:r>
@@ -2846,6 +3016,7 @@
 <w:ftr xmlns:m="http://schemas.openxmlformats.org/officeDocument/2006/math" xmlns:mc="http://schemas.openxmlformats.org/markup-compatibility/2006" xmlns:mo="http://schemas.microsoft.com/office/mac/office/2008/main" xmlns:mv="urn:schemas-microsoft-com:mac:vml" xmlns:o="urn:schemas-microsoft-com:office:office" xmlns:r="http://schemas.openxmlformats.org/officeDocument/2006/relationships" xmlns:v="urn:schemas-microsoft-com:vml" xmlns:w10="urn:schemas-microsoft-com:office:word" xmlns:w14="http://schemas.microsoft.com/office/word/2010/wordml" xmlns:w="http://schemas.openxmlformats.org/wordprocessingml/2006/main" xmlns:wne="http://schemas.microsoft.com/office/word/2006/wordml" xmlns:wp14="http://schemas.microsoft.com/office/word/2010/wordprocessingDrawing" xmlns:wp="http://schemas.openxmlformats.org/drawingml/2006/wordprocessingDrawing" xmlns:wpc="http://schemas.microsoft.com/office/word/2010/wordprocessingCanvas" xmlns:wpg="http://schemas.microsoft.com/office/word/2010/wordprocessingGroup" xmlns:wpi="http://schemas.microsoft.com/office/word/2010/wordprocessingInk" xmlns:wps="http://schemas.microsoft.com/office/word/2010/wordprocessingShape" mc:Ignorable="w14 wp14">
   <w:p>
     <w:pPr>
+      <w:bidi w:val="0"/>
       <w:spacing w:after="80"/>
       <w:jc w:val="right"/>
       <w:pBdr>
@@ -2861,12 +3032,14 @@
         <w:lang w:val="en-GB" w:bidi="en-GB"/>
         <w:rtl w:val="0"/>
         <w:szCs w:val="15"/>
+        <w:bCs w:val="0"/>
       </w:rPr>
       <w:t>GEM™   [ADDRESS] · [CITY] · [COUNTRY] · [POSTAL CODE]</w:t>
     </w:r>
   </w:p>
   <w:p>
     <w:pPr>
+      <w:bidi w:val="0"/>
       <w:spacing w:after="120"/>
       <w:jc w:val="right"/>
     </w:pPr>
@@ -2879,6 +3052,7 @@
         <w:lang w:val="en-GB" w:bidi="en-GB"/>
         <w:rtl w:val="0"/>
         <w:szCs w:val="15"/>
+        <w:bCs w:val="0"/>
       </w:rPr>
       <w:t>[T]   [E]   [W]</w:t>
     </w:r>
@@ -2891,6 +3065,7 @@
         <w:lang w:val="en-GB" w:bidi="en-GB"/>
         <w:rtl w:val="0"/>
         <w:szCs w:val="15"/>
+        <w:bCs w:val="0"/>
       </w:rPr>
       <w:t xml:space="preserve">     Page </w:t>
     </w:r>
@@ -2913,6 +3088,7 @@
         <w:lang w:val="en-GB" w:bidi="en-GB"/>
         <w:rtl w:val="0"/>
         <w:szCs w:val="15"/>
+        <w:bCs w:val="0"/>
       </w:rPr>
       <w:t xml:space="preserve"> of </w:t>
     </w:r>
@@ -2929,6 +3105,7 @@
   </w:p>
   <w:p>
     <w:pPr>
+      <w:bidi w:val="0"/>
       <w:jc w:val="right"/>
     </w:pPr>
     <w:r>
@@ -2940,6 +3117,7 @@
         <w:lang w:val="en-GB" w:bidi="en-GB"/>
         <w:rtl w:val="0"/>
         <w:szCs w:val="13"/>
+        <w:bCs w:val="0"/>
       </w:rPr>
       <w:t>WORKING APPLICATION / PENDING VALIDATION</w:t>
     </w:r>
@@ -2951,6 +3129,7 @@
 <w:ftr xmlns:m="http://schemas.openxmlformats.org/officeDocument/2006/math" xmlns:mc="http://schemas.openxmlformats.org/markup-compatibility/2006" xmlns:mo="http://schemas.microsoft.com/office/mac/office/2008/main" xmlns:mv="urn:schemas-microsoft-com:mac:vml" xmlns:o="urn:schemas-microsoft-com:office:office" xmlns:r="http://schemas.openxmlformats.org/officeDocument/2006/relationships" xmlns:v="urn:schemas-microsoft-com:vml" xmlns:w10="urn:schemas-microsoft-com:office:word" xmlns:w14="http://schemas.microsoft.com/office/word/2010/wordml" xmlns:w="http://schemas.openxmlformats.org/wordprocessingml/2006/main" xmlns:wne="http://schemas.microsoft.com/office/word/2006/wordml" xmlns:wp14="http://schemas.microsoft.com/office/word/2010/wordprocessingDrawing" xmlns:wp="http://schemas.openxmlformats.org/drawingml/2006/wordprocessingDrawing" xmlns:wpc="http://schemas.microsoft.com/office/word/2010/wordprocessingCanvas" xmlns:wpg="http://schemas.microsoft.com/office/word/2010/wordprocessingGroup" xmlns:wpi="http://schemas.microsoft.com/office/word/2010/wordprocessingInk" xmlns:wps="http://schemas.microsoft.com/office/word/2010/wordprocessingShape" mc:Ignorable="w14 wp14">
   <w:p>
     <w:pPr>
+      <w:bidi w:val="0"/>
       <w:spacing w:after="80"/>
       <w:jc w:val="right"/>
       <w:pBdr>
@@ -2966,12 +3145,14 @@
         <w:lang w:val="en-GB" w:bidi="en-GB"/>
         <w:rtl w:val="0"/>
         <w:szCs w:val="15"/>
+        <w:bCs w:val="0"/>
       </w:rPr>
       <w:t>GEM™   [ADDRESS] · [CITY] · [COUNTRY] · [POSTAL CODE]</w:t>
     </w:r>
   </w:p>
   <w:p>
     <w:pPr>
+      <w:bidi w:val="0"/>
       <w:spacing w:after="120"/>
       <w:jc w:val="right"/>
     </w:pPr>
@@ -2984,6 +3165,7 @@
         <w:lang w:val="en-GB" w:bidi="en-GB"/>
         <w:rtl w:val="0"/>
         <w:szCs w:val="15"/>
+        <w:bCs w:val="0"/>
       </w:rPr>
       <w:t>[T]   [E]   [W]</w:t>
     </w:r>
@@ -2996,6 +3178,7 @@
         <w:lang w:val="en-GB" w:bidi="en-GB"/>
         <w:rtl w:val="0"/>
         <w:szCs w:val="15"/>
+        <w:bCs w:val="0"/>
       </w:rPr>
       <w:t xml:space="preserve">     Page </w:t>
     </w:r>
@@ -3018,6 +3201,7 @@
         <w:lang w:val="en-GB" w:bidi="en-GB"/>
         <w:rtl w:val="0"/>
         <w:szCs w:val="15"/>
+        <w:bCs w:val="0"/>
       </w:rPr>
       <w:t xml:space="preserve"> of </w:t>
     </w:r>
@@ -3034,6 +3218,7 @@
   </w:p>
   <w:p>
     <w:pPr>
+      <w:bidi w:val="0"/>
       <w:jc w:val="right"/>
     </w:pPr>
     <w:r>
@@ -3045,6 +3230,7 @@
         <w:lang w:val="en-GB" w:bidi="en-GB"/>
         <w:rtl w:val="0"/>
         <w:szCs w:val="13"/>
+        <w:bCs w:val="0"/>
       </w:rPr>
       <w:t>WORKING APPLICATION / PENDING VALIDATION</w:t>
     </w:r>
@@ -3056,6 +3242,7 @@
 <w:ftr xmlns:m="http://schemas.openxmlformats.org/officeDocument/2006/math" xmlns:mc="http://schemas.openxmlformats.org/markup-compatibility/2006" xmlns:mo="http://schemas.microsoft.com/office/mac/office/2008/main" xmlns:mv="urn:schemas-microsoft-com:mac:vml" xmlns:o="urn:schemas-microsoft-com:office:office" xmlns:r="http://schemas.openxmlformats.org/officeDocument/2006/relationships" xmlns:v="urn:schemas-microsoft-com:vml" xmlns:w10="urn:schemas-microsoft-com:office:word" xmlns:w14="http://schemas.microsoft.com/office/word/2010/wordml" xmlns:w="http://schemas.openxmlformats.org/wordprocessingml/2006/main" xmlns:wne="http://schemas.microsoft.com/office/word/2006/wordml" xmlns:wp14="http://schemas.microsoft.com/office/word/2010/wordprocessingDrawing" xmlns:wp="http://schemas.openxmlformats.org/drawingml/2006/wordprocessingDrawing" xmlns:wpc="http://schemas.microsoft.com/office/word/2010/wordprocessingCanvas" xmlns:wpg="http://schemas.microsoft.com/office/word/2010/wordprocessingGroup" xmlns:wpi="http://schemas.microsoft.com/office/word/2010/wordprocessingInk" xmlns:wps="http://schemas.microsoft.com/office/word/2010/wordprocessingShape" mc:Ignorable="w14 wp14">
   <w:p>
     <w:pPr>
+      <w:bidi w:val="0"/>
       <w:spacing w:after="80"/>
       <w:jc w:val="right"/>
       <w:pBdr>
@@ -3071,12 +3258,14 @@
         <w:lang w:val="en-GB" w:bidi="en-GB"/>
         <w:rtl w:val="0"/>
         <w:szCs w:val="15"/>
+        <w:bCs w:val="0"/>
       </w:rPr>
       <w:t>GEM™   [ADDRESS] · [CITY] · [COUNTRY] · [POSTAL CODE]</w:t>
     </w:r>
   </w:p>
   <w:p>
     <w:pPr>
+      <w:bidi w:val="0"/>
       <w:spacing w:after="120"/>
       <w:jc w:val="right"/>
     </w:pPr>
@@ -3089,6 +3278,7 @@
         <w:lang w:val="en-GB" w:bidi="en-GB"/>
         <w:rtl w:val="0"/>
         <w:szCs w:val="15"/>
+        <w:bCs w:val="0"/>
       </w:rPr>
       <w:t>[T]   [E]   [W]</w:t>
     </w:r>
@@ -3101,6 +3291,7 @@
         <w:lang w:val="en-GB" w:bidi="en-GB"/>
         <w:rtl w:val="0"/>
         <w:szCs w:val="15"/>
+        <w:bCs w:val="0"/>
       </w:rPr>
       <w:t xml:space="preserve">     Page </w:t>
     </w:r>
@@ -3123,6 +3314,7 @@
         <w:lang w:val="en-GB" w:bidi="en-GB"/>
         <w:rtl w:val="0"/>
         <w:szCs w:val="15"/>
+        <w:bCs w:val="0"/>
       </w:rPr>
       <w:t xml:space="preserve"> of </w:t>
     </w:r>
@@ -3139,6 +3331,7 @@
   </w:p>
   <w:p>
     <w:pPr>
+      <w:bidi w:val="0"/>
       <w:jc w:val="right"/>
     </w:pPr>
     <w:r>
@@ -3150,6 +3343,7 @@
         <w:lang w:val="en-GB" w:bidi="en-GB"/>
         <w:rtl w:val="0"/>
         <w:szCs w:val="13"/>
+        <w:bCs w:val="0"/>
       </w:rPr>
       <w:t>WORKING APPLICATION / PENDING VALIDATION</w:t>
     </w:r>
@@ -3167,6 +3361,7 @@
 <w:ftr xmlns:m="http://schemas.openxmlformats.org/officeDocument/2006/math" xmlns:mc="http://schemas.openxmlformats.org/markup-compatibility/2006" xmlns:mo="http://schemas.microsoft.com/office/mac/office/2008/main" xmlns:mv="urn:schemas-microsoft-com:mac:vml" xmlns:o="urn:schemas-microsoft-com:office:office" xmlns:r="http://schemas.openxmlformats.org/officeDocument/2006/relationships" xmlns:v="urn:schemas-microsoft-com:vml" xmlns:w10="urn:schemas-microsoft-com:office:word" xmlns:w14="http://schemas.microsoft.com/office/word/2010/wordml" xmlns:w="http://schemas.openxmlformats.org/wordprocessingml/2006/main" xmlns:wne="http://schemas.microsoft.com/office/word/2006/wordml" xmlns:wp14="http://schemas.microsoft.com/office/word/2010/wordprocessingDrawing" xmlns:wp="http://schemas.openxmlformats.org/drawingml/2006/wordprocessingDrawing" xmlns:wpc="http://schemas.microsoft.com/office/word/2010/wordprocessingCanvas" xmlns:wpg="http://schemas.microsoft.com/office/word/2010/wordprocessingGroup" xmlns:wpi="http://schemas.microsoft.com/office/word/2010/wordprocessingInk" xmlns:wps="http://schemas.microsoft.com/office/word/2010/wordprocessingShape" mc:Ignorable="w14 wp14">
   <w:p>
     <w:pPr>
+      <w:bidi w:val="0"/>
       <w:spacing w:after="80"/>
       <w:jc w:val="right"/>
       <w:pBdr>
@@ -3182,12 +3377,14 @@
         <w:lang w:val="en-GB" w:bidi="en-GB"/>
         <w:rtl w:val="0"/>
         <w:szCs w:val="15"/>
+        <w:bCs w:val="0"/>
       </w:rPr>
       <w:t>GEM™   [ADDRESS] · [CITY] · [COUNTRY] · [POSTAL CODE]</w:t>
     </w:r>
   </w:p>
   <w:p>
     <w:pPr>
+      <w:bidi w:val="0"/>
       <w:spacing w:after="120"/>
       <w:jc w:val="right"/>
     </w:pPr>
@@ -3200,6 +3397,7 @@
         <w:lang w:val="en-GB" w:bidi="en-GB"/>
         <w:rtl w:val="0"/>
         <w:szCs w:val="15"/>
+        <w:bCs w:val="0"/>
       </w:rPr>
       <w:t>[T]   [E]   [W]</w:t>
     </w:r>
@@ -3212,6 +3410,7 @@
         <w:lang w:val="en-GB" w:bidi="en-GB"/>
         <w:rtl w:val="0"/>
         <w:szCs w:val="15"/>
+        <w:bCs w:val="0"/>
       </w:rPr>
       <w:t xml:space="preserve">     Page </w:t>
     </w:r>
@@ -3234,6 +3433,7 @@
         <w:lang w:val="en-GB" w:bidi="en-GB"/>
         <w:rtl w:val="0"/>
         <w:szCs w:val="15"/>
+        <w:bCs w:val="0"/>
       </w:rPr>
       <w:t xml:space="preserve"> of </w:t>
     </w:r>
@@ -3250,6 +3450,7 @@
   </w:p>
   <w:p>
     <w:pPr>
+      <w:bidi w:val="0"/>
       <w:jc w:val="right"/>
     </w:pPr>
     <w:r>
@@ -3261,6 +3462,7 @@
         <w:lang w:val="en-GB" w:bidi="en-GB"/>
         <w:rtl w:val="0"/>
         <w:szCs w:val="13"/>
+        <w:bCs w:val="0"/>
       </w:rPr>
       <w:t>WORKING APPLICATION / PENDING VALIDATION</w:t>
     </w:r>
@@ -3272,7 +3474,8 @@
 <w:hdr xmlns:m="http://schemas.openxmlformats.org/officeDocument/2006/math" xmlns:mc="http://schemas.openxmlformats.org/markup-compatibility/2006" xmlns:mo="http://schemas.microsoft.com/office/mac/office/2008/main" xmlns:mv="urn:schemas-microsoft-com:mac:vml" xmlns:o="urn:schemas-microsoft-com:office:office" xmlns:r="http://schemas.openxmlformats.org/officeDocument/2006/relationships" xmlns:v="urn:schemas-microsoft-com:vml" xmlns:w10="urn:schemas-microsoft-com:office:word" xmlns:w14="http://schemas.microsoft.com/office/word/2010/wordml" xmlns:w="http://schemas.openxmlformats.org/wordprocessingml/2006/main" xmlns:wne="http://schemas.microsoft.com/office/word/2006/wordml" xmlns:wp14="http://schemas.microsoft.com/office/word/2010/wordprocessingDrawing" xmlns:wp="http://schemas.openxmlformats.org/drawingml/2006/wordprocessingDrawing" xmlns:wpc="http://schemas.microsoft.com/office/word/2010/wordprocessingCanvas" xmlns:wpg="http://schemas.microsoft.com/office/word/2010/wordprocessingGroup" xmlns:wpi="http://schemas.microsoft.com/office/word/2010/wordprocessingInk" xmlns:wps="http://schemas.microsoft.com/office/word/2010/wordprocessingShape" mc:Ignorable="w14 wp14">
   <w:p>
     <w:pPr>
-      <w:spacing w:after="0"/>
+      <w:bidi w:val="0"/>
+      <w:spacing w:after="0" w:line="240" w:lineRule="auto"/>
       <w:jc w:val="left"/>
     </w:pPr>
     <w:r>
@@ -3284,6 +3487,7 @@
         <w:lang w:val="en-GB" w:bidi="en-GB"/>
         <w:rtl w:val="0"/>
         <w:szCs w:val="18"/>
+        <w:bCs w:val="0"/>
       </w:rPr>
       <w:t>GEM™</w:t>
     </w:r>
@@ -3296,6 +3500,7 @@
         <w:lang w:val="en-GB" w:bidi="en-GB"/>
         <w:rtl w:val="0"/>
         <w:szCs w:val="16"/>
+        <w:bCs w:val="0"/>
       </w:rPr>
       <w:t xml:space="preserve">    [REFERENCE NUMBER]</w:t>
     </w:r>
@@ -3307,7 +3512,8 @@
 <w:hdr xmlns:m="http://schemas.openxmlformats.org/officeDocument/2006/math" xmlns:mc="http://schemas.openxmlformats.org/markup-compatibility/2006" xmlns:mo="http://schemas.microsoft.com/office/mac/office/2008/main" xmlns:mv="urn:schemas-microsoft-com:mac:vml" xmlns:o="urn:schemas-microsoft-com:office:office" xmlns:r="http://schemas.openxmlformats.org/officeDocument/2006/relationships" xmlns:v="urn:schemas-microsoft-com:vml" xmlns:w10="urn:schemas-microsoft-com:office:word" xmlns:w14="http://schemas.microsoft.com/office/word/2010/wordml" xmlns:w="http://schemas.openxmlformats.org/wordprocessingml/2006/main" xmlns:wne="http://schemas.microsoft.com/office/word/2006/wordml" xmlns:wp14="http://schemas.microsoft.com/office/word/2010/wordprocessingDrawing" xmlns:wp="http://schemas.openxmlformats.org/drawingml/2006/wordprocessingDrawing" xmlns:wpc="http://schemas.microsoft.com/office/word/2010/wordprocessingCanvas" xmlns:wpg="http://schemas.microsoft.com/office/word/2010/wordprocessingGroup" xmlns:wpi="http://schemas.microsoft.com/office/word/2010/wordprocessingInk" xmlns:wps="http://schemas.microsoft.com/office/word/2010/wordprocessingShape" mc:Ignorable="w14 wp14">
   <w:p>
     <w:pPr>
-      <w:spacing w:after="0"/>
+      <w:bidi w:val="0"/>
+      <w:spacing w:after="0" w:line="240" w:lineRule="auto"/>
       <w:jc w:val="right"/>
     </w:pPr>
     <w:r>
@@ -3353,7 +3559,8 @@
   </w:p>
   <w:p>
     <w:pPr>
-      <w:spacing w:before="680" w:after="227"/>
+      <w:bidi w:val="0"/>
+      <w:spacing w:before="680" w:after="227" w:line="300" w:lineRule="exact"/>
       <w:jc w:val="right"/>
     </w:pPr>
     <w:r>
@@ -3361,10 +3568,12 @@
         <w:rFonts w:ascii="Jost" w:hAnsi="Jost" w:cs="Jost" w:eastAsia="Jost"/>
         <w:b w:val="0"/>
         <w:color w:val="12171D"/>
-        <w:sz w:val="16"/>
+        <w:sz w:val="21"/>
         <w:lang w:val="en-GB" w:bidi="en-GB"/>
         <w:rtl w:val="0"/>
-        <w:szCs w:val="16"/>
+        <w:szCs w:val="21"/>
+        <w:bCs w:val="0"/>
+        <w:spacing w:val="38"/>
       </w:rPr>
       <w:t>HOSPITALITY, IN PERFECT PROPORTION</w:t>
     </w:r>
@@ -3376,7 +3585,8 @@
 <w:hdr xmlns:m="http://schemas.openxmlformats.org/officeDocument/2006/math" xmlns:mc="http://schemas.openxmlformats.org/markup-compatibility/2006" xmlns:mo="http://schemas.microsoft.com/office/mac/office/2008/main" xmlns:mv="urn:schemas-microsoft-com:mac:vml" xmlns:o="urn:schemas-microsoft-com:office:office" xmlns:r="http://schemas.openxmlformats.org/officeDocument/2006/relationships" xmlns:v="urn:schemas-microsoft-com:vml" xmlns:w10="urn:schemas-microsoft-com:office:word" xmlns:w14="http://schemas.microsoft.com/office/word/2010/wordml" xmlns:w="http://schemas.openxmlformats.org/wordprocessingml/2006/main" xmlns:wne="http://schemas.microsoft.com/office/word/2006/wordml" xmlns:wp14="http://schemas.microsoft.com/office/word/2010/wordprocessingDrawing" xmlns:wp="http://schemas.openxmlformats.org/drawingml/2006/wordprocessingDrawing" xmlns:wpc="http://schemas.microsoft.com/office/word/2010/wordprocessingCanvas" xmlns:wpg="http://schemas.microsoft.com/office/word/2010/wordprocessingGroup" xmlns:wpi="http://schemas.microsoft.com/office/word/2010/wordprocessingInk" xmlns:wps="http://schemas.microsoft.com/office/word/2010/wordprocessingShape" mc:Ignorable="w14 wp14">
   <w:p>
     <w:pPr>
-      <w:spacing w:after="0"/>
+      <w:bidi w:val="0"/>
+      <w:spacing w:after="0" w:line="240" w:lineRule="auto"/>
       <w:jc w:val="right"/>
     </w:pPr>
     <w:r>
@@ -3388,6 +3598,7 @@
         <w:lang w:val="en-GB" w:bidi="en-GB"/>
         <w:rtl w:val="0"/>
         <w:szCs w:val="18"/>
+        <w:bCs w:val="0"/>
       </w:rPr>
       <w:t>GEM™</w:t>
     </w:r>
@@ -3400,6 +3611,7 @@
         <w:lang w:val="en-GB" w:bidi="en-GB"/>
         <w:rtl w:val="0"/>
         <w:szCs w:val="16"/>
+        <w:bCs w:val="0"/>
       </w:rPr>
       <w:t xml:space="preserve">    [REFERENCE NUMBER]</w:t>
     </w:r>
@@ -3417,7 +3629,8 @@
 <w:hdr xmlns:m="http://schemas.openxmlformats.org/officeDocument/2006/math" xmlns:mc="http://schemas.openxmlformats.org/markup-compatibility/2006" xmlns:mo="http://schemas.microsoft.com/office/mac/office/2008/main" xmlns:mv="urn:schemas-microsoft-com:mac:vml" xmlns:o="urn:schemas-microsoft-com:office:office" xmlns:r="http://schemas.openxmlformats.org/officeDocument/2006/relationships" xmlns:v="urn:schemas-microsoft-com:vml" xmlns:w10="urn:schemas-microsoft-com:office:word" xmlns:w14="http://schemas.microsoft.com/office/word/2010/wordml" xmlns:w="http://schemas.openxmlformats.org/wordprocessingml/2006/main" xmlns:wne="http://schemas.microsoft.com/office/word/2006/wordml" xmlns:wp14="http://schemas.microsoft.com/office/word/2010/wordprocessingDrawing" xmlns:wp="http://schemas.openxmlformats.org/drawingml/2006/wordprocessingDrawing" xmlns:wpc="http://schemas.microsoft.com/office/word/2010/wordprocessingCanvas" xmlns:wpg="http://schemas.microsoft.com/office/word/2010/wordprocessingGroup" xmlns:wpi="http://schemas.microsoft.com/office/word/2010/wordprocessingInk" xmlns:wps="http://schemas.microsoft.com/office/word/2010/wordprocessingShape" mc:Ignorable="w14 wp14">
   <w:p>
     <w:pPr>
-      <w:spacing w:after="0"/>
+      <w:bidi w:val="0"/>
+      <w:spacing w:after="0" w:line="240" w:lineRule="auto"/>
       <w:jc w:val="left"/>
     </w:pPr>
     <w:r>
@@ -3429,6 +3642,7 @@
         <w:lang w:val="en-GB" w:bidi="en-GB"/>
         <w:rtl w:val="0"/>
         <w:szCs w:val="18"/>
+        <w:bCs w:val="0"/>
       </w:rPr>
       <w:t>GEM™</w:t>
     </w:r>
@@ -3441,6 +3655,7 @@
         <w:lang w:val="en-GB" w:bidi="en-GB"/>
         <w:rtl w:val="0"/>
         <w:szCs w:val="16"/>
+        <w:bCs w:val="0"/>
       </w:rPr>
       <w:t xml:space="preserve">    [REFERENCE NUMBER]</w:t>
     </w:r>
@@ -3452,7 +3667,8 @@
 <w:hdr xmlns:m="http://schemas.openxmlformats.org/officeDocument/2006/math" xmlns:mc="http://schemas.openxmlformats.org/markup-compatibility/2006" xmlns:mo="http://schemas.microsoft.com/office/mac/office/2008/main" xmlns:mv="urn:schemas-microsoft-com:mac:vml" xmlns:o="urn:schemas-microsoft-com:office:office" xmlns:r="http://schemas.openxmlformats.org/officeDocument/2006/relationships" xmlns:v="urn:schemas-microsoft-com:vml" xmlns:w10="urn:schemas-microsoft-com:office:word" xmlns:w14="http://schemas.microsoft.com/office/word/2010/wordml" xmlns:w="http://schemas.openxmlformats.org/wordprocessingml/2006/main" xmlns:wne="http://schemas.microsoft.com/office/word/2006/wordml" xmlns:wp14="http://schemas.microsoft.com/office/word/2010/wordprocessingDrawing" xmlns:wp="http://schemas.openxmlformats.org/drawingml/2006/wordprocessingDrawing" xmlns:wpc="http://schemas.microsoft.com/office/word/2010/wordprocessingCanvas" xmlns:wpg="http://schemas.microsoft.com/office/word/2010/wordprocessingGroup" xmlns:wpi="http://schemas.microsoft.com/office/word/2010/wordprocessingInk" xmlns:wps="http://schemas.microsoft.com/office/word/2010/wordprocessingShape" mc:Ignorable="w14 wp14">
   <w:p>
     <w:pPr>
-      <w:spacing w:after="0"/>
+      <w:bidi w:val="0"/>
+      <w:spacing w:after="0" w:line="240" w:lineRule="auto"/>
       <w:jc w:val="left"/>
     </w:pPr>
     <w:r>
@@ -3498,7 +3714,8 @@
   </w:p>
   <w:p>
     <w:pPr>
-      <w:spacing w:before="680" w:after="227"/>
+      <w:bidi w:val="0"/>
+      <w:spacing w:before="680" w:after="227" w:line="300" w:lineRule="exact"/>
       <w:jc w:val="left"/>
     </w:pPr>
     <w:r>
@@ -3506,10 +3723,12 @@
         <w:rFonts w:ascii="Jost" w:hAnsi="Jost" w:cs="Jost" w:eastAsia="Jost"/>
         <w:b w:val="0"/>
         <w:color w:val="12171D"/>
-        <w:sz w:val="16"/>
+        <w:sz w:val="21"/>
         <w:lang w:val="en-GB" w:bidi="en-GB"/>
         <w:rtl w:val="0"/>
-        <w:szCs w:val="16"/>
+        <w:szCs w:val="21"/>
+        <w:bCs w:val="0"/>
+        <w:spacing w:val="38"/>
       </w:rPr>
       <w:t>HOSPITALITY, IN PERFECT PROPORTION</w:t>
     </w:r>
@@ -3521,7 +3740,8 @@
 <w:hdr xmlns:m="http://schemas.openxmlformats.org/officeDocument/2006/math" xmlns:mc="http://schemas.openxmlformats.org/markup-compatibility/2006" xmlns:mo="http://schemas.microsoft.com/office/mac/office/2008/main" xmlns:mv="urn:schemas-microsoft-com:mac:vml" xmlns:o="urn:schemas-microsoft-com:office:office" xmlns:r="http://schemas.openxmlformats.org/officeDocument/2006/relationships" xmlns:v="urn:schemas-microsoft-com:vml" xmlns:w10="urn:schemas-microsoft-com:office:word" xmlns:w14="http://schemas.microsoft.com/office/word/2010/wordml" xmlns:w="http://schemas.openxmlformats.org/wordprocessingml/2006/main" xmlns:wne="http://schemas.microsoft.com/office/word/2006/wordml" xmlns:wp14="http://schemas.microsoft.com/office/word/2010/wordprocessingDrawing" xmlns:wp="http://schemas.openxmlformats.org/drawingml/2006/wordprocessingDrawing" xmlns:wpc="http://schemas.microsoft.com/office/word/2010/wordprocessingCanvas" xmlns:wpg="http://schemas.microsoft.com/office/word/2010/wordprocessingGroup" xmlns:wpi="http://schemas.microsoft.com/office/word/2010/wordprocessingInk" xmlns:wps="http://schemas.microsoft.com/office/word/2010/wordprocessingShape" mc:Ignorable="w14 wp14">
   <w:p>
     <w:pPr>
-      <w:spacing w:after="0"/>
+      <w:bidi w:val="0"/>
+      <w:spacing w:after="0" w:line="240" w:lineRule="auto"/>
       <w:jc w:val="left"/>
     </w:pPr>
     <w:r>
@@ -3533,6 +3753,7 @@
         <w:lang w:val="en-GB" w:bidi="en-GB"/>
         <w:rtl w:val="0"/>
         <w:szCs w:val="18"/>
+        <w:bCs w:val="0"/>
       </w:rPr>
       <w:t>GEM™</w:t>
     </w:r>
@@ -3545,6 +3766,7 @@
         <w:lang w:val="en-GB" w:bidi="en-GB"/>
         <w:rtl w:val="0"/>
         <w:szCs w:val="16"/>
+        <w:bCs w:val="0"/>
       </w:rPr>
       <w:t xml:space="preserve">    [REFERENCE NUMBER]</w:t>
     </w:r>
@@ -3556,7 +3778,8 @@
 <w:hdr xmlns:m="http://schemas.openxmlformats.org/officeDocument/2006/math" xmlns:mc="http://schemas.openxmlformats.org/markup-compatibility/2006" xmlns:mo="http://schemas.microsoft.com/office/mac/office/2008/main" xmlns:mv="urn:schemas-microsoft-com:mac:vml" xmlns:o="urn:schemas-microsoft-com:office:office" xmlns:r="http://schemas.openxmlformats.org/officeDocument/2006/relationships" xmlns:v="urn:schemas-microsoft-com:vml" xmlns:w10="urn:schemas-microsoft-com:office:word" xmlns:w14="http://schemas.microsoft.com/office/word/2010/wordml" xmlns:w="http://schemas.openxmlformats.org/wordprocessingml/2006/main" xmlns:wne="http://schemas.microsoft.com/office/word/2006/wordml" xmlns:wp14="http://schemas.microsoft.com/office/word/2010/wordprocessingDrawing" xmlns:wp="http://schemas.openxmlformats.org/drawingml/2006/wordprocessingDrawing" xmlns:wpc="http://schemas.microsoft.com/office/word/2010/wordprocessingCanvas" xmlns:wpg="http://schemas.microsoft.com/office/word/2010/wordprocessingGroup" xmlns:wpi="http://schemas.microsoft.com/office/word/2010/wordprocessingInk" xmlns:wps="http://schemas.microsoft.com/office/word/2010/wordprocessingShape" mc:Ignorable="w14 wp14">
   <w:p>
     <w:pPr>
-      <w:spacing w:after="680"/>
+      <w:bidi w:val="0"/>
+      <w:spacing w:after="680" w:line="240" w:lineRule="auto"/>
       <w:jc w:val="left"/>
     </w:pPr>
     <w:r>
@@ -3607,7 +3830,8 @@
 <w:hdr xmlns:m="http://schemas.openxmlformats.org/officeDocument/2006/math" xmlns:mc="http://schemas.openxmlformats.org/markup-compatibility/2006" xmlns:mo="http://schemas.microsoft.com/office/mac/office/2008/main" xmlns:mv="urn:schemas-microsoft-com:mac:vml" xmlns:o="urn:schemas-microsoft-com:office:office" xmlns:r="http://schemas.openxmlformats.org/officeDocument/2006/relationships" xmlns:v="urn:schemas-microsoft-com:vml" xmlns:w10="urn:schemas-microsoft-com:office:word" xmlns:w14="http://schemas.microsoft.com/office/word/2010/wordml" xmlns:w="http://schemas.openxmlformats.org/wordprocessingml/2006/main" xmlns:wne="http://schemas.microsoft.com/office/word/2006/wordml" xmlns:wp14="http://schemas.microsoft.com/office/word/2010/wordprocessingDrawing" xmlns:wp="http://schemas.openxmlformats.org/drawingml/2006/wordprocessingDrawing" xmlns:wpc="http://schemas.microsoft.com/office/word/2010/wordprocessingCanvas" xmlns:wpg="http://schemas.microsoft.com/office/word/2010/wordprocessingGroup" xmlns:wpi="http://schemas.microsoft.com/office/word/2010/wordprocessingInk" xmlns:wps="http://schemas.microsoft.com/office/word/2010/wordprocessingShape" mc:Ignorable="w14 wp14">
   <w:p>
     <w:pPr>
-      <w:spacing w:after="0"/>
+      <w:bidi w:val="0"/>
+      <w:spacing w:after="0" w:line="240" w:lineRule="auto"/>
       <w:jc w:val="left"/>
     </w:pPr>
     <w:r>
@@ -3653,7 +3877,8 @@
   </w:p>
   <w:p>
     <w:pPr>
-      <w:spacing w:before="680" w:after="227"/>
+      <w:bidi w:val="0"/>
+      <w:spacing w:before="680" w:after="227" w:line="300" w:lineRule="exact"/>
       <w:jc w:val="left"/>
     </w:pPr>
     <w:r>
@@ -3661,10 +3886,12 @@
         <w:rFonts w:ascii="Jost" w:hAnsi="Jost" w:cs="Jost" w:eastAsia="Jost"/>
         <w:b w:val="0"/>
         <w:color w:val="12171D"/>
-        <w:sz w:val="16"/>
+        <w:sz w:val="21"/>
         <w:lang w:val="en-GB" w:bidi="en-GB"/>
         <w:rtl w:val="0"/>
-        <w:szCs w:val="16"/>
+        <w:szCs w:val="21"/>
+        <w:bCs w:val="0"/>
+        <w:spacing w:val="38"/>
       </w:rPr>
       <w:t>HOSPITALITY, IN PERFECT PROPORTION</w:t>
     </w:r>
@@ -3676,7 +3903,8 @@
 <w:hdr xmlns:m="http://schemas.openxmlformats.org/officeDocument/2006/math" xmlns:mc="http://schemas.openxmlformats.org/markup-compatibility/2006" xmlns:mo="http://schemas.microsoft.com/office/mac/office/2008/main" xmlns:mv="urn:schemas-microsoft-com:mac:vml" xmlns:o="urn:schemas-microsoft-com:office:office" xmlns:r="http://schemas.openxmlformats.org/officeDocument/2006/relationships" xmlns:v="urn:schemas-microsoft-com:vml" xmlns:w10="urn:schemas-microsoft-com:office:word" xmlns:w14="http://schemas.microsoft.com/office/word/2010/wordml" xmlns:w="http://schemas.openxmlformats.org/wordprocessingml/2006/main" xmlns:wne="http://schemas.microsoft.com/office/word/2006/wordml" xmlns:wp14="http://schemas.microsoft.com/office/word/2010/wordprocessingDrawing" xmlns:wp="http://schemas.openxmlformats.org/drawingml/2006/wordprocessingDrawing" xmlns:wpc="http://schemas.microsoft.com/office/word/2010/wordprocessingCanvas" xmlns:wpg="http://schemas.microsoft.com/office/word/2010/wordprocessingGroup" xmlns:wpi="http://schemas.microsoft.com/office/word/2010/wordprocessingInk" xmlns:wps="http://schemas.microsoft.com/office/word/2010/wordprocessingShape" mc:Ignorable="w14 wp14">
   <w:p>
     <w:pPr>
-      <w:spacing w:after="0"/>
+      <w:bidi w:val="0"/>
+      <w:spacing w:after="0" w:line="240" w:lineRule="auto"/>
       <w:jc w:val="left"/>
     </w:pPr>
     <w:r>
@@ -3688,6 +3916,7 @@
         <w:lang w:val="en-GB" w:bidi="en-GB"/>
         <w:rtl w:val="0"/>
         <w:szCs w:val="18"/>
+        <w:bCs w:val="0"/>
       </w:rPr>
       <w:t>GEM™</w:t>
     </w:r>
@@ -3700,6 +3929,7 @@
         <w:lang w:val="en-GB" w:bidi="en-GB"/>
         <w:rtl w:val="0"/>
         <w:szCs w:val="16"/>
+        <w:bCs w:val="0"/>
       </w:rPr>
       <w:t xml:space="preserve">    [REFERENCE NUMBER]</w:t>
     </w:r>
@@ -3717,7 +3947,8 @@
 <w:hdr xmlns:m="http://schemas.openxmlformats.org/officeDocument/2006/math" xmlns:mc="http://schemas.openxmlformats.org/markup-compatibility/2006" xmlns:mo="http://schemas.microsoft.com/office/mac/office/2008/main" xmlns:mv="urn:schemas-microsoft-com:mac:vml" xmlns:o="urn:schemas-microsoft-com:office:office" xmlns:r="http://schemas.openxmlformats.org/officeDocument/2006/relationships" xmlns:v="urn:schemas-microsoft-com:vml" xmlns:w10="urn:schemas-microsoft-com:office:word" xmlns:w14="http://schemas.microsoft.com/office/word/2010/wordml" xmlns:w="http://schemas.openxmlformats.org/wordprocessingml/2006/main" xmlns:wne="http://schemas.microsoft.com/office/word/2006/wordml" xmlns:wp14="http://schemas.microsoft.com/office/word/2010/wordprocessingDrawing" xmlns:wp="http://schemas.openxmlformats.org/drawingml/2006/wordprocessingDrawing" xmlns:wpc="http://schemas.microsoft.com/office/word/2010/wordprocessingCanvas" xmlns:wpg="http://schemas.microsoft.com/office/word/2010/wordprocessingGroup" xmlns:wpi="http://schemas.microsoft.com/office/word/2010/wordprocessingInk" xmlns:wps="http://schemas.microsoft.com/office/word/2010/wordprocessingShape" mc:Ignorable="w14 wp14">
   <w:p>
     <w:pPr>
-      <w:spacing w:after="0"/>
+      <w:bidi w:val="0"/>
+      <w:spacing w:after="0" w:line="240" w:lineRule="auto"/>
       <w:jc w:val="right"/>
     </w:pPr>
     <w:r>
@@ -3729,6 +3960,7 @@
         <w:lang w:val="en-GB" w:bidi="en-GB"/>
         <w:rtl w:val="0"/>
         <w:szCs w:val="18"/>
+        <w:bCs w:val="0"/>
       </w:rPr>
       <w:t>GEM™</w:t>
     </w:r>
@@ -3741,6 +3973,7 @@
         <w:lang w:val="en-GB" w:bidi="en-GB"/>
         <w:rtl w:val="0"/>
         <w:szCs w:val="16"/>
+        <w:bCs w:val="0"/>
       </w:rPr>
       <w:t xml:space="preserve">    [REFERENCE NUMBER]</w:t>
     </w:r>
@@ -3752,7 +3985,8 @@
 <w:hdr xmlns:m="http://schemas.openxmlformats.org/officeDocument/2006/math" xmlns:mc="http://schemas.openxmlformats.org/markup-compatibility/2006" xmlns:mo="http://schemas.microsoft.com/office/mac/office/2008/main" xmlns:mv="urn:schemas-microsoft-com:mac:vml" xmlns:o="urn:schemas-microsoft-com:office:office" xmlns:r="http://schemas.openxmlformats.org/officeDocument/2006/relationships" xmlns:v="urn:schemas-microsoft-com:vml" xmlns:w10="urn:schemas-microsoft-com:office:word" xmlns:w14="http://schemas.microsoft.com/office/word/2010/wordml" xmlns:w="http://schemas.openxmlformats.org/wordprocessingml/2006/main" xmlns:wne="http://schemas.microsoft.com/office/word/2006/wordml" xmlns:wp14="http://schemas.microsoft.com/office/word/2010/wordprocessingDrawing" xmlns:wp="http://schemas.openxmlformats.org/drawingml/2006/wordprocessingDrawing" xmlns:wpc="http://schemas.microsoft.com/office/word/2010/wordprocessingCanvas" xmlns:wpg="http://schemas.microsoft.com/office/word/2010/wordprocessingGroup" xmlns:wpi="http://schemas.microsoft.com/office/word/2010/wordprocessingInk" xmlns:wps="http://schemas.microsoft.com/office/word/2010/wordprocessingShape" mc:Ignorable="w14 wp14">
   <w:p>
     <w:pPr>
-      <w:spacing w:after="0"/>
+      <w:bidi w:val="0"/>
+      <w:spacing w:after="0" w:line="240" w:lineRule="auto"/>
       <w:jc w:val="right"/>
     </w:pPr>
     <w:r>
@@ -3798,7 +4032,8 @@
   </w:p>
   <w:p>
     <w:pPr>
-      <w:spacing w:before="680" w:after="227"/>
+      <w:bidi w:val="0"/>
+      <w:spacing w:before="680" w:after="227" w:line="300" w:lineRule="exact"/>
       <w:jc w:val="right"/>
     </w:pPr>
     <w:r>
@@ -3806,10 +4041,12 @@
         <w:rFonts w:ascii="Jost" w:hAnsi="Jost" w:cs="Jost" w:eastAsia="Jost"/>
         <w:b w:val="0"/>
         <w:color w:val="12171D"/>
-        <w:sz w:val="16"/>
+        <w:sz w:val="21"/>
         <w:lang w:val="en-GB" w:bidi="en-GB"/>
         <w:rtl w:val="0"/>
-        <w:szCs w:val="16"/>
+        <w:szCs w:val="21"/>
+        <w:bCs w:val="0"/>
+        <w:spacing w:val="38"/>
       </w:rPr>
       <w:t>HOSPITALITY, IN PERFECT PROPORTION</w:t>
     </w:r>
@@ -3821,7 +4058,8 @@
 <w:hdr xmlns:m="http://schemas.openxmlformats.org/officeDocument/2006/math" xmlns:mc="http://schemas.openxmlformats.org/markup-compatibility/2006" xmlns:mo="http://schemas.microsoft.com/office/mac/office/2008/main" xmlns:mv="urn:schemas-microsoft-com:mac:vml" xmlns:o="urn:schemas-microsoft-com:office:office" xmlns:r="http://schemas.openxmlformats.org/officeDocument/2006/relationships" xmlns:v="urn:schemas-microsoft-com:vml" xmlns:w10="urn:schemas-microsoft-com:office:word" xmlns:w14="http://schemas.microsoft.com/office/word/2010/wordml" xmlns:w="http://schemas.openxmlformats.org/wordprocessingml/2006/main" xmlns:wne="http://schemas.microsoft.com/office/word/2006/wordml" xmlns:wp14="http://schemas.microsoft.com/office/word/2010/wordprocessingDrawing" xmlns:wp="http://schemas.openxmlformats.org/drawingml/2006/wordprocessingDrawing" xmlns:wpc="http://schemas.microsoft.com/office/word/2010/wordprocessingCanvas" xmlns:wpg="http://schemas.microsoft.com/office/word/2010/wordprocessingGroup" xmlns:wpi="http://schemas.microsoft.com/office/word/2010/wordprocessingInk" xmlns:wps="http://schemas.microsoft.com/office/word/2010/wordprocessingShape" mc:Ignorable="w14 wp14">
   <w:p>
     <w:pPr>
-      <w:spacing w:after="0"/>
+      <w:bidi w:val="0"/>
+      <w:spacing w:after="0" w:line="240" w:lineRule="auto"/>
       <w:jc w:val="right"/>
     </w:pPr>
     <w:r>
@@ -3833,6 +4071,7 @@
         <w:lang w:val="en-GB" w:bidi="en-GB"/>
         <w:rtl w:val="0"/>
         <w:szCs w:val="18"/>
+        <w:bCs w:val="0"/>
       </w:rPr>
       <w:t>GEM™</w:t>
     </w:r>
@@ -3845,6 +4084,7 @@
         <w:lang w:val="en-GB" w:bidi="en-GB"/>
         <w:rtl w:val="0"/>
         <w:szCs w:val="16"/>
+        <w:bCs w:val="0"/>
       </w:rPr>
       <w:t xml:space="preserve">    [REFERENCE NUMBER]</w:t>
     </w:r>
@@ -3862,7 +4102,8 @@
 <w:hdr xmlns:m="http://schemas.openxmlformats.org/officeDocument/2006/math" xmlns:mc="http://schemas.openxmlformats.org/markup-compatibility/2006" xmlns:mo="http://schemas.microsoft.com/office/mac/office/2008/main" xmlns:mv="urn:schemas-microsoft-com:mac:vml" xmlns:o="urn:schemas-microsoft-com:office:office" xmlns:r="http://schemas.openxmlformats.org/officeDocument/2006/relationships" xmlns:v="urn:schemas-microsoft-com:vml" xmlns:w10="urn:schemas-microsoft-com:office:word" xmlns:w14="http://schemas.microsoft.com/office/word/2010/wordml" xmlns:w="http://schemas.openxmlformats.org/wordprocessingml/2006/main" xmlns:wne="http://schemas.microsoft.com/office/word/2006/wordml" xmlns:wp14="http://schemas.microsoft.com/office/word/2010/wordprocessingDrawing" xmlns:wp="http://schemas.openxmlformats.org/drawingml/2006/wordprocessingDrawing" xmlns:wpc="http://schemas.microsoft.com/office/word/2010/wordprocessingCanvas" xmlns:wpg="http://schemas.microsoft.com/office/word/2010/wordprocessingGroup" xmlns:wpi="http://schemas.microsoft.com/office/word/2010/wordprocessingInk" xmlns:wps="http://schemas.microsoft.com/office/word/2010/wordprocessingShape" mc:Ignorable="w14 wp14">
   <w:p>
     <w:pPr>
-      <w:spacing w:after="0"/>
+      <w:bidi w:val="0"/>
+      <w:spacing w:after="0" w:line="240" w:lineRule="auto"/>
       <w:jc w:val="right"/>
     </w:pPr>
     <w:r>
@@ -3874,6 +4115,7 @@
         <w:lang w:val="en-GB" w:bidi="en-GB"/>
         <w:rtl w:val="0"/>
         <w:szCs w:val="18"/>
+        <w:bCs w:val="0"/>
       </w:rPr>
       <w:t>GEM™</w:t>
     </w:r>
@@ -3886,6 +4128,7 @@
         <w:lang w:val="en-GB" w:bidi="en-GB"/>
         <w:rtl w:val="0"/>
         <w:szCs w:val="16"/>
+        <w:bCs w:val="0"/>
       </w:rPr>
       <w:t xml:space="preserve">    [REFERENCE NUMBER]</w:t>
     </w:r>
@@ -4101,10 +4344,12 @@
   <w:docDefaults>
     <w:rPrDefault>
       <w:rPr>
-        <w:rFonts w:asciiTheme="minorHAnsi" w:eastAsiaTheme="minorEastAsia" w:hAnsiTheme="minorHAnsi" w:cstheme="minorBidi"/>
-        <w:sz w:val="22"/>
-        <w:szCs w:val="22"/>
-        <w:lang w:val="en-US" w:eastAsia="en-US" w:bidi="ar-SA"/>
+        <w:rFonts w:ascii="Inter" w:hAnsi="Inter" w:cs="Noto Sans Arabic" w:eastAsia="Inter"/>
+        <w:lang w:val="en-GB" w:bidi="ar-SA"/>
+        <w:sz w:val="21"/>
+        <w:szCs w:val="23"/>
+        <w:b w:val="0"/>
+        <w:bCs w:val="0"/>
       </w:rPr>
     </w:rPrDefault>
     <w:pPrDefault>
@@ -4256,10 +4501,20 @@
     <w:name w:val="Normal"/>
     <w:qFormat/>
     <w:rsid w:val="00FC693F"/>
+    <w:pPr>
+      <w:bidi w:val="0"/>
+      <w:jc w:val="left"/>
+      <w:spacing w:line="336" w:lineRule="exact" w:after="120"/>
+    </w:pPr>
     <w:rPr>
-      <w:rFonts w:ascii="Inter" w:hAnsi="Inter"/>
       <w:color w:val="12171D"/>
       <w:sz w:val="21"/>
+      <w:rFonts w:ascii="Inter" w:hAnsi="Inter" w:cs="Noto Sans Arabic" w:eastAsia="Inter"/>
+      <w:b w:val="0"/>
+      <w:bCs w:val="0"/>
+      <w:spacing w:val="0"/>
+      <w:lang w:val="en-GB" w:bidi="ar-SA"/>
+      <w:szCs w:val="23"/>
     </w:rPr>
   </w:style>
   <w:style w:type="paragraph" w:styleId="Header">
@@ -4319,14 +4574,18 @@
       <w:keepLines/>
       <w:spacing w:before="480" w:after="0"/>
       <w:outlineLvl w:val="0"/>
+      <w:bidi w:val="0"/>
+      <w:jc w:val="left"/>
     </w:pPr>
     <w:rPr>
-      <w:rFonts w:asciiTheme="majorHAnsi" w:eastAsiaTheme="majorEastAsia" w:hAnsiTheme="majorHAnsi" w:cstheme="majorBidi" w:ascii="Jost" w:hAnsi="Jost"/>
-      <w:b/>
-      <w:bCs/>
       <w:color w:val="12171D"/>
       <w:sz w:val="24"/>
-      <w:szCs w:val="28"/>
+      <w:rFonts w:ascii="Jost" w:hAnsi="Jost" w:cs="Noto Sans Arabic" w:eastAsia="Inter"/>
+      <w:b w:val="0"/>
+      <w:bCs w:val="0"/>
+      <w:spacing w:val="0"/>
+      <w:lang w:val="en-GB" w:bidi="ar-SA"/>
+      <w:szCs w:val="24"/>
     </w:rPr>
   </w:style>
   <w:style w:type="paragraph" w:styleId="Heading2">
@@ -4343,14 +4602,18 @@
       <w:keepLines/>
       <w:spacing w:before="200" w:after="0"/>
       <w:outlineLvl w:val="1"/>
+      <w:bidi w:val="0"/>
+      <w:jc w:val="left"/>
     </w:pPr>
     <w:rPr>
-      <w:rFonts w:asciiTheme="majorHAnsi" w:eastAsiaTheme="majorEastAsia" w:hAnsiTheme="majorHAnsi" w:cstheme="majorBidi" w:ascii="Jost" w:hAnsi="Jost"/>
-      <w:b/>
-      <w:bCs/>
       <w:color w:val="12171D"/>
       <w:sz w:val="24"/>
-      <w:szCs w:val="26"/>
+      <w:rFonts w:ascii="Jost" w:hAnsi="Jost" w:cs="Noto Sans Arabic" w:eastAsia="Inter"/>
+      <w:b w:val="0"/>
+      <w:bCs w:val="0"/>
+      <w:spacing w:val="0"/>
+      <w:lang w:val="en-GB" w:bidi="ar-SA"/>
+      <w:szCs w:val="24"/>
     </w:rPr>
   </w:style>
   <w:style w:type="paragraph" w:styleId="Heading3">
@@ -4558,12 +4821,14 @@
     <w:uiPriority w:val="9"/>
     <w:rsid w:val="00FC693F"/>
     <w:rPr>
-      <w:rFonts w:asciiTheme="majorHAnsi" w:eastAsiaTheme="majorEastAsia" w:hAnsiTheme="majorHAnsi" w:cstheme="majorBidi"/>
-      <w:b/>
-      <w:bCs/>
       <w:color w:val="365F91" w:themeColor="accent1" w:themeShade="BF"/>
       <w:sz w:val="28"/>
-      <w:szCs w:val="28"/>
+      <w:rFonts w:ascii="Jost" w:hAnsi="Jost" w:cs="Noto Sans Arabic" w:eastAsia="Inter"/>
+      <w:b w:val="0"/>
+      <w:bCs w:val="0"/>
+      <w:spacing w:val="0"/>
+      <w:lang w:val="en-GB" w:bidi="ar-SA"/>
+      <w:szCs w:val="24"/>
     </w:rPr>
   </w:style>
   <w:style w:type="character" w:customStyle="1" w:styleId="Heading2Char">
@@ -4573,12 +4838,14 @@
     <w:uiPriority w:val="9"/>
     <w:rsid w:val="00FC693F"/>
     <w:rPr>
-      <w:rFonts w:asciiTheme="majorHAnsi" w:eastAsiaTheme="majorEastAsia" w:hAnsiTheme="majorHAnsi" w:cstheme="majorBidi"/>
-      <w:b/>
-      <w:bCs/>
       <w:color w:val="4F81BD" w:themeColor="accent1"/>
       <w:sz w:val="26"/>
-      <w:szCs w:val="26"/>
+      <w:rFonts w:ascii="Jost" w:hAnsi="Jost" w:cs="Noto Sans Arabic" w:eastAsia="Inter"/>
+      <w:b w:val="0"/>
+      <w:bCs w:val="0"/>
+      <w:spacing w:val="0"/>
+      <w:lang w:val="en-GB" w:bidi="ar-SA"/>
+      <w:szCs w:val="24"/>
     </w:rPr>
   </w:style>
   <w:style w:type="character" w:customStyle="1" w:styleId="Heading3Char">
@@ -4692,7 +4959,19 @@
     <w:rsid w:val="00AA1D8D"/>
     <w:pPr>
       <w:spacing w:after="120"/>
-    </w:pPr>
+      <w:bidi w:val="0"/>
+      <w:ind w:right="1701"/>
+      <w:jc w:val="left"/>
+      <w:spacing w:line="336" w:lineRule="exact" w:after="120"/>
+    </w:pPr>
+    <w:rPr>
+      <w:rFonts w:ascii="Inter" w:hAnsi="Inter" w:cs="Noto Sans Arabic" w:eastAsia="Inter"/>
+      <w:b w:val="0"/>
+      <w:bCs w:val="0"/>
+      <w:spacing w:val="0"/>
+      <w:lang w:val="en-GB" w:bidi="ar-SA"/>
+      <w:szCs w:val="23"/>
+    </w:rPr>
   </w:style>
   <w:style w:type="character" w:customStyle="1" w:styleId="BodyTextChar">
     <w:name w:val="Body Text Char"/>

</xml_diff>